<commit_message>
Major cleanup and feature updates: unified font sizing system, enhanced UI components, improved tag selection, template optimizations, and comprehensive documentation
</commit_message>
<xml_diff>
--- a/src/core/generation/templates/Double.docx
+++ b/src/core/generation/templates/Double.docx
@@ -53,7 +53,7 @@
             <w:tr>
               <w:trPr>
                 <w:cantSplit/>
-                <w:trHeight w:hRule="exact" w:val="2030"/>
+                <w:trHeight w:val="2026"/>
               </w:trPr>
               <w:tc>
                 <w:tcPr>
@@ -303,18 +303,6 @@
               </w:rPr>
               <w:t xml:space="preserve"> </w:t>
             </w:r>
-          </w:p>
-          <w:p>
-            <w:pPr>
-              <w:jc w:val="center"/>
-              <w:rPr>
-                <w:rFonts w:ascii="Arial" w:hAnsi="Arial" w:cs="Arial"/>
-                <w:b/>
-                <w:bCs/>
-                <w:sz w:val="10"/>
-                <w:szCs w:val="10"/>
-              </w:rPr>
-            </w:pPr>
             <w:r>
               <w:rPr>
                 <w:rFonts w:ascii="Arial" w:hAnsi="Arial" w:cs="Arial"/>

</xml_diff>

<commit_message>
Update app functionality and templates - comprehensive changes including ratio font sizing, template processing, and UI enhancements
</commit_message>
<xml_diff>
--- a/src/core/generation/templates/Double.docx
+++ b/src/core/generation/templates/Double.docx
@@ -30,9 +30,10 @@
           </w:tcPr>
           <w:tbl>
             <w:tblPr>
-              <w:tblpPr w:leftFromText="187" w:rightFromText="187" w:vertAnchor="page" w:horzAnchor="margin" w:tblpX="81" w:tblpY="87"/>
+              <w:tblpPr w:leftFromText="187" w:rightFromText="187" w:vertAnchor="page" w:horzAnchor="margin" w:tblpXSpec="center" w:tblpY="87"/>
               <w:tblOverlap w:val="never"/>
               <w:tblW w:w="2340" w:type="dxa"/>
+              <w:jc w:val="center"/>
               <w:tblBorders>
                 <w:top w:val="single" w:sz="4" w:space="0" w:color="FFFFFF" w:themeColor="background1"/>
                 <w:left w:val="single" w:sz="4" w:space="0" w:color="FFFFFF" w:themeColor="background1"/>
@@ -53,7 +54,8 @@
             <w:tr>
               <w:trPr>
                 <w:cantSplit/>
-                <w:trHeight w:val="2026"/>
+                <w:trHeight w:hRule="exact" w:val="2052"/>
+                <w:jc w:val="center"/>
               </w:trPr>
               <w:tc>
                 <w:tcPr>
@@ -67,8 +69,9 @@
                   <w:shd w:val="clear" w:color="auto" w:fill="FFFFFF" w:themeFill="background1"/>
                   <w:tcMar>
                     <w:top w:w="72" w:type="dxa"/>
-                    <w:left w:w="115" w:type="dxa"/>
-                    <w:right w:w="14" w:type="dxa"/>
+                    <w:left w:w="72" w:type="dxa"/>
+                    <w:bottom w:w="72" w:type="dxa"/>
+                    <w:right w:w="72" w:type="dxa"/>
                   </w:tcMar>
                 </w:tcPr>
                 <w:p>
@@ -150,9 +153,9 @@
               <w:tblLook w:val="04A0" w:firstRow="1" w:lastRow="0" w:firstColumn="1" w:lastColumn="0" w:noHBand="0" w:noVBand="1"/>
             </w:tblPr>
             <w:tblGrid>
-              <w:gridCol w:w="990"/>
-              <w:gridCol w:w="540"/>
-              <w:gridCol w:w="810"/>
+              <w:gridCol w:w="972"/>
+              <w:gridCol w:w="468"/>
+              <w:gridCol w:w="900"/>
             </w:tblGrid>
             <w:tr>
               <w:trPr>
@@ -161,7 +164,7 @@
               </w:trPr>
               <w:tc>
                 <w:tcPr>
-                  <w:tcW w:w="990" w:type="dxa"/>
+                  <w:tcW w:w="972" w:type="dxa"/>
                   <w:shd w:val="clear" w:color="auto" w:fill="FFFFFF" w:themeFill="background1"/>
                   <w:noWrap/>
                   <w:vAlign w:val="center"/>
@@ -190,7 +193,7 @@
               </w:tc>
               <w:tc>
                 <w:tcPr>
-                  <w:tcW w:w="540" w:type="dxa"/>
+                  <w:tcW w:w="468" w:type="dxa"/>
                   <w:shd w:val="clear" w:color="auto" w:fill="FFFFFF" w:themeFill="background1"/>
                   <w:tcMar>
                     <w:left w:w="14" w:type="dxa"/>
@@ -220,7 +223,7 @@
               </w:tc>
               <w:tc>
                 <w:tcPr>
-                  <w:tcW w:w="810" w:type="dxa"/>
+                  <w:tcW w:w="900" w:type="dxa"/>
                   <w:tcBorders>
                     <w:left w:val="nil"/>
                   </w:tcBorders>
@@ -303,6 +306,18 @@
               </w:rPr>
               <w:t xml:space="preserve"> </w:t>
             </w:r>
+          </w:p>
+          <w:p>
+            <w:pPr>
+              <w:jc w:val="center"/>
+              <w:rPr>
+                <w:rFonts w:ascii="Arial" w:hAnsi="Arial" w:cs="Arial"/>
+                <w:b/>
+                <w:bCs/>
+                <w:sz w:val="10"/>
+                <w:szCs w:val="10"/>
+              </w:rPr>
+            </w:pPr>
             <w:r>
               <w:rPr>
                 <w:rFonts w:ascii="Arial" w:hAnsi="Arial" w:cs="Arial"/>
@@ -351,12 +366,6 @@
           <w:vanish/>
         </w:rPr>
       </w:pPr>
-      <w:r>
-        <w:rPr>
-          <w:vanish/>
-        </w:rPr>
-        <w:t xml:space="preserve"> </w:t>
-      </w:r>
     </w:p>
     <w:sectPr>
       <w:type w:val="continuous"/>

</xml_diff>

<commit_message>
Fix 3x3 horizontal template issue - create proper template with all placeholders and resolve duplication problems
</commit_message>
<xml_diff>
--- a/src/core/generation/templates/Double.docx
+++ b/src/core/generation/templates/Double.docx
@@ -30,10 +30,9 @@
           </w:tcPr>
           <w:tbl>
             <w:tblPr>
-              <w:tblpPr w:leftFromText="187" w:rightFromText="187" w:vertAnchor="page" w:horzAnchor="margin" w:tblpXSpec="center" w:tblpY="87"/>
+              <w:tblpPr w:leftFromText="187" w:rightFromText="187" w:vertAnchor="page" w:horzAnchor="margin" w:tblpX="81" w:tblpY="87"/>
               <w:tblOverlap w:val="never"/>
               <w:tblW w:w="2340" w:type="dxa"/>
-              <w:jc w:val="center"/>
               <w:tblBorders>
                 <w:top w:val="single" w:sz="4" w:space="0" w:color="FFFFFF" w:themeColor="background1"/>
                 <w:left w:val="single" w:sz="4" w:space="0" w:color="FFFFFF" w:themeColor="background1"/>
@@ -54,8 +53,7 @@
             <w:tr>
               <w:trPr>
                 <w:cantSplit/>
-                <w:trHeight w:hRule="exact" w:val="2052"/>
-                <w:jc w:val="center"/>
+                <w:trHeight w:hRule="exact" w:val="1963"/>
               </w:trPr>
               <w:tc>
                 <w:tcPr>
@@ -69,9 +67,8 @@
                   <w:shd w:val="clear" w:color="auto" w:fill="FFFFFF" w:themeFill="background1"/>
                   <w:tcMar>
                     <w:top w:w="72" w:type="dxa"/>
-                    <w:left w:w="72" w:type="dxa"/>
-                    <w:bottom w:w="72" w:type="dxa"/>
-                    <w:right w:w="72" w:type="dxa"/>
+                    <w:left w:w="115" w:type="dxa"/>
+                    <w:right w:w="14" w:type="dxa"/>
                   </w:tcMar>
                 </w:tcPr>
                 <w:p>
@@ -81,8 +78,8 @@
                       <w:rFonts w:ascii="Arial" w:hAnsi="Arial" w:cs="Arial"/>
                       <w:b/>
                       <w:bCs/>
-                      <w:sz w:val="32"/>
-                      <w:szCs w:val="32"/>
+                      <w:sz w:val="15"/>
+                      <w:szCs w:val="15"/>
                     </w:rPr>
                   </w:pPr>
                   <w:r>
@@ -90,30 +87,10 @@
                       <w:rFonts w:ascii="Arial" w:hAnsi="Arial" w:cs="Arial"/>
                       <w:b/>
                       <w:bCs/>
-                      <w:sz w:val="32"/>
-                      <w:szCs w:val="32"/>
+                      <w:sz w:val="15"/>
+                      <w:szCs w:val="15"/>
                     </w:rPr>
-                    <w:t>{{Label1.</w:t>
-                  </w:r>
-                  <w:r>
-                    <w:rPr>
-                      <w:rFonts w:ascii="Arial" w:hAnsi="Arial" w:cs="Arial"/>
-                      <w:b/>
-                      <w:bCs/>
-                      <w:sz w:val="32"/>
-                      <w:szCs w:val="32"/>
-                    </w:rPr>
-                    <w:t>DescAndWeight</w:t>
-                  </w:r>
-                  <w:r>
-                    <w:rPr>
-                      <w:rFonts w:ascii="Arial" w:hAnsi="Arial" w:cs="Arial"/>
-                      <w:b/>
-                      <w:bCs/>
-                      <w:sz w:val="32"/>
-                      <w:szCs w:val="32"/>
-                    </w:rPr>
-                    <w:t>}}</w:t>
+                    <w:t>{{Label1.DescAndWeight}}</w:t>
                   </w:r>
                 </w:p>
                 <w:p>
@@ -134,7 +111,7 @@
           <w:tbl>
             <w:tblPr>
               <w:tblStyle w:val="TableGrid"/>
-              <w:tblpPr w:vertAnchor="page" w:horzAnchor="margin" w:tblpXSpec="center" w:tblpY="2530"/>
+              <w:tblpPr w:vertAnchor="page" w:horzAnchor="margin" w:tblpXSpec="center" w:tblpY="2379"/>
               <w:tblOverlap w:val="never"/>
               <w:tblW w:w="2340" w:type="dxa"/>
               <w:tblBorders>
@@ -153,18 +130,18 @@
               <w:tblLook w:val="04A0" w:firstRow="1" w:lastRow="0" w:firstColumn="1" w:lastColumn="0" w:noHBand="0" w:noVBand="1"/>
             </w:tblPr>
             <w:tblGrid>
-              <w:gridCol w:w="972"/>
-              <w:gridCol w:w="468"/>
-              <w:gridCol w:w="900"/>
+              <w:gridCol w:w="990"/>
+              <w:gridCol w:w="567"/>
+              <w:gridCol w:w="783"/>
             </w:tblGrid>
             <w:tr>
               <w:trPr>
                 <w:cantSplit/>
-                <w:trHeight w:hRule="exact" w:val="897"/>
+                <w:trHeight w:hRule="exact" w:val="992"/>
               </w:trPr>
               <w:tc>
                 <w:tcPr>
-                  <w:tcW w:w="972" w:type="dxa"/>
+                  <w:tcW w:w="990" w:type="dxa"/>
                   <w:shd w:val="clear" w:color="auto" w:fill="FFFFFF" w:themeFill="background1"/>
                   <w:noWrap/>
                   <w:vAlign w:val="center"/>
@@ -193,7 +170,7 @@
               </w:tc>
               <w:tc>
                 <w:tcPr>
-                  <w:tcW w:w="468" w:type="dxa"/>
+                  <w:tcW w:w="567" w:type="dxa"/>
                   <w:shd w:val="clear" w:color="auto" w:fill="FFFFFF" w:themeFill="background1"/>
                   <w:tcMar>
                     <w:left w:w="14" w:type="dxa"/>
@@ -206,16 +183,16 @@
                     <w:rPr>
                       <w:b/>
                       <w:bCs/>
-                      <w:sz w:val="11"/>
-                      <w:szCs w:val="11"/>
+                      <w:sz w:val="13"/>
+                      <w:szCs w:val="13"/>
                     </w:rPr>
                   </w:pPr>
                   <w:r>
                     <w:rPr>
                       <w:b/>
                       <w:bCs/>
-                      <w:sz w:val="11"/>
-                      <w:szCs w:val="11"/>
+                      <w:sz w:val="13"/>
+                      <w:szCs w:val="13"/>
                     </w:rPr>
                     <w:t>{{Label1.DOH}}</w:t>
                   </w:r>
@@ -223,7 +200,7 @@
               </w:tc>
               <w:tc>
                 <w:tcPr>
-                  <w:tcW w:w="900" w:type="dxa"/>
+                  <w:tcW w:w="783" w:type="dxa"/>
                   <w:tcBorders>
                     <w:left w:val="nil"/>
                   </w:tcBorders>
@@ -238,8 +215,8 @@
                 <w:p>
                   <w:pPr>
                     <w:rPr>
-                      <w:sz w:val="13"/>
-                      <w:szCs w:val="13"/>
+                      <w:sz w:val="10"/>
+                      <w:szCs w:val="10"/>
                     </w:rPr>
                   </w:pPr>
                   <w:r>
@@ -247,8 +224,8 @@
                       <w:rFonts w:ascii="Arial" w:hAnsi="Arial" w:cs="Arial"/>
                       <w:b/>
                       <w:bCs/>
-                      <w:sz w:val="13"/>
-                      <w:szCs w:val="13"/>
+                      <w:sz w:val="10"/>
+                      <w:szCs w:val="10"/>
                     </w:rPr>
                     <w:t>{{Label1.Ratio_or_THC_CBD}}</w:t>
                   </w:r>
@@ -309,13 +286,12 @@
           </w:p>
           <w:p>
             <w:pPr>
-              <w:jc w:val="center"/>
               <w:rPr>
                 <w:rFonts w:ascii="Arial" w:hAnsi="Arial" w:cs="Arial"/>
                 <w:b/>
                 <w:bCs/>
-                <w:sz w:val="10"/>
-                <w:szCs w:val="10"/>
+                <w:sz w:val="11"/>
+                <w:szCs w:val="11"/>
               </w:rPr>
             </w:pPr>
             <w:r>
@@ -366,6 +342,12 @@
           <w:vanish/>
         </w:rPr>
       </w:pPr>
+      <w:r>
+        <w:rPr>
+          <w:vanish/>
+        </w:rPr>
+        <w:t xml:space="preserve"> </w:t>
+      </w:r>
     </w:p>
     <w:sectPr>
       <w:type w:val="continuous"/>

</xml_diff>

<commit_message>
Enhanced marker cleanup, font sizing improvements, and vendor filtering optimizations
</commit_message>
<xml_diff>
--- a/src/core/generation/templates/Double.docx
+++ b/src/core/generation/templates/Double.docx
@@ -111,9 +111,10 @@
           <w:tbl>
             <w:tblPr>
               <w:tblStyle w:val="TableGrid"/>
-              <w:tblpPr w:vertAnchor="page" w:horzAnchor="margin" w:tblpXSpec="center" w:tblpY="2379"/>
+              <w:tblpPr w:vertAnchor="page" w:horzAnchor="margin" w:tblpXSpec="center" w:tblpY="2455"/>
               <w:tblOverlap w:val="never"/>
               <w:tblW w:w="2340" w:type="dxa"/>
+              <w:jc w:val="center"/>
               <w:tblBorders>
                 <w:top w:val="none" w:sz="0" w:space="0" w:color="auto"/>
                 <w:left w:val="none" w:sz="0" w:space="0" w:color="auto"/>
@@ -130,18 +131,19 @@
               <w:tblLook w:val="04A0" w:firstRow="1" w:lastRow="0" w:firstColumn="1" w:lastColumn="0" w:noHBand="0" w:noVBand="1"/>
             </w:tblPr>
             <w:tblGrid>
-              <w:gridCol w:w="990"/>
-              <w:gridCol w:w="567"/>
+              <w:gridCol w:w="1026"/>
+              <w:gridCol w:w="531"/>
               <w:gridCol w:w="783"/>
             </w:tblGrid>
             <w:tr>
               <w:trPr>
                 <w:cantSplit/>
-                <w:trHeight w:hRule="exact" w:val="992"/>
+                <w:trHeight w:hRule="exact" w:val="900"/>
+                <w:jc w:val="center"/>
               </w:trPr>
               <w:tc>
                 <w:tcPr>
-                  <w:tcW w:w="990" w:type="dxa"/>
+                  <w:tcW w:w="1026" w:type="dxa"/>
                   <w:shd w:val="clear" w:color="auto" w:fill="FFFFFF" w:themeFill="background1"/>
                   <w:noWrap/>
                   <w:vAlign w:val="center"/>
@@ -170,7 +172,7 @@
               </w:tc>
               <w:tc>
                 <w:tcPr>
-                  <w:tcW w:w="567" w:type="dxa"/>
+                  <w:tcW w:w="531" w:type="dxa"/>
                   <w:shd w:val="clear" w:color="auto" w:fill="FFFFFF" w:themeFill="background1"/>
                   <w:tcMar>
                     <w:left w:w="14" w:type="dxa"/>
@@ -239,49 +241,30 @@
                 <w:rFonts w:ascii="Arial" w:hAnsi="Arial" w:cs="Arial"/>
                 <w:b/>
                 <w:bCs/>
-                <w:sz w:val="11"/>
-                <w:szCs w:val="11"/>
+                <w:sz w:val="6"/>
+                <w:szCs w:val="6"/>
               </w:rPr>
             </w:pPr>
             <w:r>
               <w:rPr>
-                <w:rFonts w:ascii="Arial" w:hAnsi="Arial" w:cs="Arial"/>
-                <w:b/>
-                <w:bCs/>
-                <w:sz w:val="11"/>
-                <w:szCs w:val="11"/>
+                <w:sz w:val="20"/>
+                <w:szCs w:val="20"/>
               </w:rPr>
-              <w:t>{{Label1.</w:t>
+              <w:t xml:space="preserve">{{Label1.Lineage}}  </w:t>
             </w:r>
             <w:r>
               <w:rPr>
-                <w:rFonts w:ascii="Arial" w:hAnsi="Arial" w:cs="Arial"/>
-                <w:b/>
-                <w:bCs/>
-                <w:sz w:val="11"/>
-                <w:szCs w:val="11"/>
+                <w:sz w:val="6"/>
+                <w:szCs w:val="6"/>
               </w:rPr>
-              <w:t>Lineage</w:t>
+              <w:t>{{Label1.ProductVendor</w:t>
             </w:r>
             <w:r>
               <w:rPr>
-                <w:rFonts w:ascii="Arial" w:hAnsi="Arial" w:cs="Arial"/>
-                <w:b/>
-                <w:bCs/>
-                <w:sz w:val="11"/>
-                <w:szCs w:val="11"/>
+                <w:sz w:val="20"/>
+                <w:szCs w:val="20"/>
               </w:rPr>
               <w:t>}}</w:t>
-            </w:r>
-            <w:r>
-              <w:rPr>
-                <w:rFonts w:ascii="Arial" w:hAnsi="Arial" w:cs="Arial"/>
-                <w:b/>
-                <w:bCs/>
-                <w:sz w:val="11"/>
-                <w:szCs w:val="11"/>
-              </w:rPr>
-              <w:t xml:space="preserve"> </w:t>
             </w:r>
           </w:p>
           <w:p>

</xml_diff>

<commit_message>
Fix mini template generation issues
- Enhanced _expand_template_to_4x5_fixed_scaled() to preserve original design
- Added proper color, border, and styling preservation during expansion
- Implemented _apply_mini_template_font_sizing() for optimal text sizing
- Improved mini template processing pipeline with better error handling
- Fixed cell dimensions enforcement to maintain 1.5" x 1.5" cells
- Added enhanced brand centering and text formatting for mini templates
- Fixed datetime import issue in template processor

Mini template now properly generates 4x5 grids (20 labels per page) while
preserving original template design and ensuring optimal text formatting.
</commit_message>
<xml_diff>
--- a/src/core/generation/templates/Double.docx
+++ b/src/core/generation/templates/Double.docx
@@ -26,13 +26,17 @@
           <w:tcPr>
             <w:tcW w:w="2520" w:type="dxa"/>
             <w:noWrap/>
+            <w:tcMar>
+              <w:left w:w="58" w:type="dxa"/>
+            </w:tcMar>
             <w:vAlign w:val="center"/>
           </w:tcPr>
           <w:tbl>
             <w:tblPr>
-              <w:tblpPr w:leftFromText="187" w:rightFromText="187" w:vertAnchor="page" w:horzAnchor="margin" w:tblpX="81" w:tblpY="87"/>
+              <w:tblpPr w:leftFromText="187" w:rightFromText="187" w:vertAnchor="page" w:horzAnchor="margin" w:tblpXSpec="center" w:tblpY="116"/>
               <w:tblOverlap w:val="never"/>
               <w:tblW w:w="2340" w:type="dxa"/>
+              <w:jc w:val="center"/>
               <w:tblBorders>
                 <w:top w:val="single" w:sz="4" w:space="0" w:color="FFFFFF" w:themeColor="background1"/>
                 <w:left w:val="single" w:sz="4" w:space="0" w:color="FFFFFF" w:themeColor="background1"/>
@@ -54,6 +58,7 @@
               <w:trPr>
                 <w:cantSplit/>
                 <w:trHeight w:hRule="exact" w:val="1963"/>
+                <w:jc w:val="center"/>
               </w:trPr>
               <w:tc>
                 <w:tcPr>
@@ -138,7 +143,7 @@
             <w:tr>
               <w:trPr>
                 <w:cantSplit/>
-                <w:trHeight w:hRule="exact" w:val="900"/>
+                <w:trHeight w:hRule="exact" w:val="990"/>
                 <w:jc w:val="center"/>
               </w:trPr>
               <w:tc>
@@ -241,30 +246,19 @@
                 <w:rFonts w:ascii="Arial" w:hAnsi="Arial" w:cs="Arial"/>
                 <w:b/>
                 <w:bCs/>
-                <w:sz w:val="6"/>
-                <w:szCs w:val="6"/>
+                <w:sz w:val="16"/>
+                <w:szCs w:val="16"/>
               </w:rPr>
             </w:pPr>
             <w:r>
               <w:rPr>
-                <w:sz w:val="20"/>
-                <w:szCs w:val="20"/>
+                <w:rFonts w:ascii="Arial" w:hAnsi="Arial" w:cs="Arial"/>
+                <w:b/>
+                <w:bCs/>
+                <w:sz w:val="16"/>
+                <w:szCs w:val="16"/>
               </w:rPr>
               <w:t xml:space="preserve">{{Label1.Lineage}}  </w:t>
-            </w:r>
-            <w:r>
-              <w:rPr>
-                <w:sz w:val="6"/>
-                <w:szCs w:val="6"/>
-              </w:rPr>
-              <w:t>{{Label1.ProductVendor</w:t>
-            </w:r>
-            <w:r>
-              <w:rPr>
-                <w:sz w:val="20"/>
-                <w:szCs w:val="20"/>
-              </w:rPr>
-              <w:t>}}</w:t>
             </w:r>
           </w:p>
           <w:p>
@@ -273,10 +267,30 @@
                 <w:rFonts w:ascii="Arial" w:hAnsi="Arial" w:cs="Arial"/>
                 <w:b/>
                 <w:bCs/>
-                <w:sz w:val="11"/>
-                <w:szCs w:val="11"/>
+                <w:sz w:val="10"/>
+                <w:szCs w:val="10"/>
               </w:rPr>
             </w:pPr>
+            <w:r>
+              <w:rPr>
+                <w:rFonts w:ascii="Arial" w:hAnsi="Arial" w:cs="Arial"/>
+                <w:b/>
+                <w:bCs/>
+                <w:sz w:val="10"/>
+                <w:szCs w:val="10"/>
+              </w:rPr>
+              <w:t>{{Label1.ProductVendor}}</w:t>
+            </w:r>
+            <w:r>
+              <w:rPr>
+                <w:rFonts w:ascii="Arial" w:hAnsi="Arial" w:cs="Arial"/>
+                <w:b/>
+                <w:bCs/>
+                <w:sz w:val="10"/>
+                <w:szCs w:val="10"/>
+              </w:rPr>
+              <w:t xml:space="preserve"> </w:t>
+            </w:r>
             <w:r>
               <w:rPr>
                 <w:rFonts w:ascii="Arial" w:hAnsi="Arial" w:cs="Arial"/>

</xml_diff>

<commit_message>
Committing all changes before push
</commit_message>
<xml_diff>
--- a/src/core/generation/templates/Double.docx
+++ b/src/core/generation/templates/Double.docx
@@ -227,14 +227,7 @@
                     </w:rPr>
                   </w:pPr>
                   <w:r>
-                    <w:rPr>
-                      <w:rFonts w:ascii="Arial" w:hAnsi="Arial" w:cs="Arial"/>
-                      <w:b/>
-                      <w:bCs/>
-                      <w:sz w:val="10"/>
-                      <w:szCs w:val="10"/>
-                    </w:rPr>
-                    <w:t>{{Label1.Ratio_or_THC_CBD}}</w:t>
+                    <w:t>{{QR}}</w:t>
                   </w:r>
                 </w:p>
               </w:tc>
@@ -259,6 +252,9 @@
                 <w:szCs w:val="16"/>
               </w:rPr>
               <w:t xml:space="preserve">{{Label1.Lineage}}  </w:t>
+            </w:r>
+            <w:r>
+              <w:br/>
             </w:r>
           </w:p>
           <w:p>

</xml_diff>

<commit_message>
Update database and codebase with latest changes including THC/CBD data, template improvements, and various bug fixes
</commit_message>
<xml_diff>
--- a/src/core/generation/templates/Double.docx
+++ b/src/core/generation/templates/Double.docx
@@ -26,17 +26,13 @@
           <w:tcPr>
             <w:tcW w:w="2520" w:type="dxa"/>
             <w:noWrap/>
-            <w:tcMar>
-              <w:left w:w="58" w:type="dxa"/>
-            </w:tcMar>
             <w:vAlign w:val="center"/>
           </w:tcPr>
           <w:tbl>
             <w:tblPr>
-              <w:tblpPr w:leftFromText="187" w:rightFromText="187" w:vertAnchor="page" w:horzAnchor="margin" w:tblpXSpec="center" w:tblpY="116"/>
+              <w:tblpPr w:leftFromText="187" w:rightFromText="187" w:vertAnchor="page" w:horzAnchor="margin" w:tblpX="81" w:tblpY="87"/>
               <w:tblOverlap w:val="never"/>
               <w:tblW w:w="2340" w:type="dxa"/>
-              <w:jc w:val="center"/>
               <w:tblBorders>
                 <w:top w:val="single" w:sz="4" w:space="0" w:color="FFFFFF" w:themeColor="background1"/>
                 <w:left w:val="single" w:sz="4" w:space="0" w:color="FFFFFF" w:themeColor="background1"/>
@@ -58,7 +54,6 @@
               <w:trPr>
                 <w:cantSplit/>
                 <w:trHeight w:hRule="exact" w:val="1963"/>
-                <w:jc w:val="center"/>
               </w:trPr>
               <w:tc>
                 <w:tcPr>
@@ -143,7 +138,7 @@
             <w:tr>
               <w:trPr>
                 <w:cantSplit/>
-                <w:trHeight w:hRule="exact" w:val="990"/>
+                <w:trHeight w:hRule="exact" w:val="900"/>
                 <w:jc w:val="center"/>
               </w:trPr>
               <w:tc>
@@ -246,19 +241,30 @@
                 <w:rFonts w:ascii="Arial" w:hAnsi="Arial" w:cs="Arial"/>
                 <w:b/>
                 <w:bCs/>
-                <w:sz w:val="16"/>
-                <w:szCs w:val="16"/>
+                <w:sz w:val="6"/>
+                <w:szCs w:val="6"/>
               </w:rPr>
             </w:pPr>
             <w:r>
               <w:rPr>
-                <w:rFonts w:ascii="Arial" w:hAnsi="Arial" w:cs="Arial"/>
-                <w:b/>
-                <w:bCs/>
-                <w:sz w:val="16"/>
-                <w:szCs w:val="16"/>
+                <w:sz w:val="20"/>
+                <w:szCs w:val="20"/>
               </w:rPr>
               <w:t xml:space="preserve">{{Label1.Lineage}}  </w:t>
+            </w:r>
+            <w:r>
+              <w:rPr>
+                <w:sz w:val="6"/>
+                <w:szCs w:val="6"/>
+              </w:rPr>
+              <w:t>{{Label1.ProductVendor</w:t>
+            </w:r>
+            <w:r>
+              <w:rPr>
+                <w:sz w:val="20"/>
+                <w:szCs w:val="20"/>
+              </w:rPr>
+              <w:t>}}</w:t>
             </w:r>
           </w:p>
           <w:p>
@@ -267,30 +273,10 @@
                 <w:rFonts w:ascii="Arial" w:hAnsi="Arial" w:cs="Arial"/>
                 <w:b/>
                 <w:bCs/>
-                <w:sz w:val="10"/>
-                <w:szCs w:val="10"/>
+                <w:sz w:val="11"/>
+                <w:szCs w:val="11"/>
               </w:rPr>
             </w:pPr>
-            <w:r>
-              <w:rPr>
-                <w:rFonts w:ascii="Arial" w:hAnsi="Arial" w:cs="Arial"/>
-                <w:b/>
-                <w:bCs/>
-                <w:sz w:val="10"/>
-                <w:szCs w:val="10"/>
-              </w:rPr>
-              <w:t>{{Label1.ProductVendor}}</w:t>
-            </w:r>
-            <w:r>
-              <w:rPr>
-                <w:rFonts w:ascii="Arial" w:hAnsi="Arial" w:cs="Arial"/>
-                <w:b/>
-                <w:bCs/>
-                <w:sz w:val="10"/>
-                <w:szCs w:val="10"/>
-              </w:rPr>
-              <w:t xml:space="preserve"> </w:t>
-            </w:r>
             <w:r>
               <w:rPr>
                 <w:rFonts w:ascii="Arial" w:hAnsi="Arial" w:cs="Arial"/>

</xml_diff>

<commit_message>
Ready for PythonAnywhere deployment - Python 3.11 with JSON match improvements
✨ Features:
- Enhanced JSON matching accuracy (threshold 0.2 → 0.4)
- Before/after comparison modal for all matches
- Better vendor validation and word overlap algorithms
- User control with accept/reject for individual matches

🚀 Deployment Files:
- Complete deployment guide and automated setup script
- Python 3.11 WSGI configuration
- Optimized requirements and fallback dependencies
- Verification and testing scripts

🛠 Production Ready:
- Memory optimizations for PythonAnywhere hosting
- Error handling and graceful dependency fallbacks
- Reduced logging and performance improvements
</commit_message>
<xml_diff>
--- a/src/core/generation/templates/Double.docx
+++ b/src/core/generation/templates/Double.docx
@@ -53,7 +53,7 @@
             <w:tr>
               <w:trPr>
                 <w:cantSplit/>
-                <w:trHeight w:hRule="exact" w:val="1963"/>
+                <w:trHeight w:val="1996"/>
               </w:trPr>
               <w:tc>
                 <w:tcPr>
@@ -111,10 +111,9 @@
           <w:tbl>
             <w:tblPr>
               <w:tblStyle w:val="TableGrid"/>
-              <w:tblpPr w:vertAnchor="page" w:horzAnchor="margin" w:tblpXSpec="center" w:tblpY="2455"/>
+              <w:tblpPr w:vertAnchor="page" w:horzAnchor="margin" w:tblpXSpec="center" w:tblpY="2610"/>
               <w:tblOverlap w:val="never"/>
               <w:tblW w:w="2340" w:type="dxa"/>
-              <w:jc w:val="center"/>
               <w:tblBorders>
                 <w:top w:val="none" w:sz="0" w:space="0" w:color="auto"/>
                 <w:left w:val="none" w:sz="0" w:space="0" w:color="auto"/>
@@ -139,7 +138,6 @@
               <w:trPr>
                 <w:cantSplit/>
                 <w:trHeight w:hRule="exact" w:val="900"/>
-                <w:jc w:val="center"/>
               </w:trPr>
               <w:tc>
                 <w:tcPr>
@@ -214,6 +212,78 @@
                   </w:tcMar>
                   <w:vAlign w:val="center"/>
                 </w:tcPr>
+                <w:tbl>
+                  <w:tblPr>
+                    <w:tblpPr w:leftFromText="288" w:rightFromText="288" w:vertAnchor="page" w:horzAnchor="margin" w:tblpXSpec="center" w:tblpY="2414"/>
+                    <w:tblOverlap w:val="never"/>
+                    <w:tblW w:w="4770" w:type="dxa"/>
+                    <w:jc w:val="center"/>
+                    <w:tblBorders>
+                      <w:top w:val="single" w:sz="4" w:space="0" w:color="FFFFFF" w:themeColor="background1"/>
+                      <w:left w:val="single" w:sz="4" w:space="0" w:color="FFFFFF" w:themeColor="background1"/>
+                      <w:bottom w:val="single" w:sz="4" w:space="0" w:color="FFFFFF" w:themeColor="background1"/>
+                      <w:right w:val="single" w:sz="4" w:space="0" w:color="FFFFFF" w:themeColor="background1"/>
+                      <w:insideH w:val="single" w:sz="4" w:space="0" w:color="FFFFFF" w:themeColor="background1"/>
+                      <w:insideV w:val="single" w:sz="4" w:space="0" w:color="FFFFFF" w:themeColor="background1"/>
+                    </w:tblBorders>
+                    <w:tblCellMar>
+                      <w:right w:w="58" w:type="dxa"/>
+                    </w:tblCellMar>
+                    <w:tblLook w:val="0000" w:firstRow="0" w:lastRow="0" w:firstColumn="0" w:lastColumn="0" w:noHBand="0" w:noVBand="0"/>
+                  </w:tblPr>
+                  <w:tblGrid>
+                    <w:gridCol w:w="4770"/>
+                  </w:tblGrid>
+                  <w:tr>
+                    <w:trPr>
+                      <w:cantSplit/>
+                      <w:trHeight w:val="820"/>
+                      <w:jc w:val="center"/>
+                    </w:trPr>
+                    <w:tc>
+                      <w:tcPr>
+                        <w:tcW w:w="1900" w:type="dxa"/>
+                        <w:tcBorders>
+                          <w:top w:val="nil"/>
+                          <w:left w:val="nil"/>
+                          <w:bottom w:val="nil"/>
+                          <w:right w:val="nil"/>
+                        </w:tcBorders>
+                        <w:shd w:val="clear" w:color="auto" w:fill="FFFFFF" w:themeFill="background1"/>
+                        <w:noWrap/>
+                        <w:tcMar>
+                          <w:top w:w="29" w:type="dxa"/>
+                          <w:left w:w="29" w:type="dxa"/>
+                          <w:bottom w:w="29" w:type="dxa"/>
+                          <w:right w:w="29" w:type="dxa"/>
+                        </w:tcMar>
+                        <w:vAlign w:val="center"/>
+                      </w:tcPr>
+                      <w:p>
+                        <w:pPr>
+                          <w:spacing w:after="0" w:line="240" w:lineRule="auto"/>
+                          <w:rPr>
+                            <w:rFonts w:ascii="Arial" w:hAnsi="Arial" w:cs="Arial"/>
+                            <w:b/>
+                            <w:bCs/>
+                            <w:sz w:val="10"/>
+                            <w:szCs w:val="10"/>
+                          </w:rPr>
+                        </w:pPr>
+                        <w:r>
+                          <w:rPr>
+                            <w:rFonts w:ascii="Arial" w:hAnsi="Arial" w:cs="Arial"/>
+                            <w:b/>
+                            <w:bCs/>
+                            <w:sz w:val="10"/>
+                            <w:szCs w:val="10"/>
+                          </w:rPr>
+                          <w:t>{{Label1.QR}}</w:t>
+                        </w:r>
+                      </w:p>
+                    </w:tc>
+                  </w:tr>
+                </w:tbl>
                 <w:p>
                   <w:pPr>
                     <w:rPr>
@@ -221,16 +291,6 @@
                       <w:szCs w:val="10"/>
                     </w:rPr>
                   </w:pPr>
-                  <w:r>
-                    <w:rPr>
-                      <w:rFonts w:ascii="Arial" w:hAnsi="Arial" w:cs="Arial"/>
-                      <w:b/>
-                      <w:bCs/>
-                      <w:sz w:val="10"/>
-                      <w:szCs w:val="10"/>
-                    </w:rPr>
-                    <w:t>{{Label1.Ratio_or_THC_CBD}}</w:t>
-                  </w:r>
                 </w:p>
               </w:tc>
             </w:tr>
@@ -250,14 +310,30 @@
                 <w:sz w:val="20"/>
                 <w:szCs w:val="20"/>
               </w:rPr>
-              <w:t xml:space="preserve">{{Label1.Lineage}}  </w:t>
+              <w:t>{{Label1.Lineage</w:t>
+            </w:r>
+            <w:proofErr w:type="gramStart"/>
+            <w:r>
+              <w:rPr>
+                <w:sz w:val="20"/>
+                <w:szCs w:val="20"/>
+              </w:rPr>
+              <w:t xml:space="preserve">}}  </w:t>
             </w:r>
             <w:r>
               <w:rPr>
                 <w:sz w:val="6"/>
                 <w:szCs w:val="6"/>
               </w:rPr>
-              <w:t>{{Label1.ProductVendor</w:t>
+              <w:t>{</w:t>
+            </w:r>
+            <w:proofErr w:type="gramEnd"/>
+            <w:r>
+              <w:rPr>
+                <w:sz w:val="6"/>
+                <w:szCs w:val="6"/>
+              </w:rPr>
+              <w:t>{Label1.ProductVendor</w:t>
             </w:r>
             <w:r>
               <w:rPr>
@@ -947,7 +1023,6 @@
   <w:style w:type="character" w:default="1" w:styleId="DefaultParagraphFont">
     <w:name w:val="Default Paragraph Font"/>
     <w:uiPriority w:val="1"/>
-    <w:semiHidden/>
     <w:unhideWhenUsed/>
   </w:style>
   <w:style w:type="table" w:default="1" w:styleId="TableNormal">

</xml_diff>

<commit_message>
FIX: Add WeightUnits field to all template files
- Added {{Label1.WeightUnits}} to vertical, horizontal, mini, and Double templates
- Weight information was being generated correctly but not displayed due to missing template fields
- Templates now include weight display for all product types
- Updated both src/core/generation/templates/ and src/templates/ directories
</commit_message>
<xml_diff>
--- a/src/core/generation/templates/Double.docx
+++ b/src/core/generation/templates/Double.docx
@@ -406,6 +406,16 @@
           <w:vanish/>
         </w:rPr>
         <w:t xml:space="preserve"> </w:t>
+      </w:r>
+    </w:p>
+    <w:p>
+      <w:r>
+        <w:t>{{Label1.Lineage}} {{Label1.ProductVendor}} {{Label1.WeightUnits}}</w:t>
+      </w:r>
+    </w:p>
+    <w:p>
+      <w:r>
+        <w:t>{{Label1.ProductStrain}} {{Label1.WeightUnits}}</w:t>
       </w:r>
     </w:p>
     <w:sectPr>

</xml_diff>

<commit_message>
Restored version with all fixes and improvements
</commit_message>
<xml_diff>
--- a/src/core/generation/templates/Double.docx
+++ b/src/core/generation/templates/Double.docx
@@ -406,16 +406,6 @@
           <w:vanish/>
         </w:rPr>
         <w:t xml:space="preserve"> </w:t>
-      </w:r>
-    </w:p>
-    <w:p>
-      <w:r>
-        <w:t>{{Label1.Lineage}} {{Label1.ProductVendor}} {{Label1.WeightUnits}}</w:t>
-      </w:r>
-    </w:p>
-    <w:p>
-      <w:r>
-        <w:t>{{Label1.ProductStrain}} {{Label1.WeightUnits}}</w:t>
       </w:r>
     </w:p>
     <w:sectPr>

</xml_diff>

<commit_message>
Fix non-breaking hyphen implementation for Pre-Roll products
- Added comprehensive non-breaking hyphen processing to ProductName, DescAndWeight fields in template_processor.py
- Fixed fix_hyphen_spacing function to use Unicode non-breaking hyphen (\u2011) instead of hyphen + non-breaking space
- Updated hanging hyphen detection patterns to work with \u2011
- Added debug logging to track non-breaking hyphen application
- Ensures 'Pre-Roll' and 'Infused Pre-Roll' never split across lines in generated labels
- Improved consistency of hyphen handling throughout the entire pipeline
</commit_message>
<xml_diff>
--- a/src/core/generation/templates/Double.docx
+++ b/src/core/generation/templates/Double.docx
@@ -26,13 +26,18 @@
           <w:tcPr>
             <w:tcW w:w="2520" w:type="dxa"/>
             <w:noWrap/>
+            <w:tcMar>
+              <w:left w:w="43" w:type="dxa"/>
+              <w:right w:w="43" w:type="dxa"/>
+            </w:tcMar>
             <w:vAlign w:val="center"/>
           </w:tcPr>
           <w:tbl>
             <w:tblPr>
-              <w:tblpPr w:leftFromText="187" w:rightFromText="187" w:vertAnchor="page" w:horzAnchor="margin" w:tblpX="81" w:tblpY="87"/>
+              <w:tblpPr w:leftFromText="187" w:rightFromText="187" w:vertAnchor="page" w:horzAnchor="margin" w:tblpXSpec="center" w:tblpY="87"/>
               <w:tblOverlap w:val="never"/>
               <w:tblW w:w="2340" w:type="dxa"/>
+              <w:jc w:val="center"/>
               <w:tblBorders>
                 <w:top w:val="single" w:sz="4" w:space="0" w:color="FFFFFF" w:themeColor="background1"/>
                 <w:left w:val="single" w:sz="4" w:space="0" w:color="FFFFFF" w:themeColor="background1"/>
@@ -53,7 +58,8 @@
             <w:tr>
               <w:trPr>
                 <w:cantSplit/>
-                <w:trHeight w:val="1996"/>
+                <w:trHeight w:hRule="exact" w:val="2142"/>
+                <w:jc w:val="center"/>
               </w:trPr>
               <w:tc>
                 <w:tcPr>
@@ -131,8 +137,8 @@
             </w:tblPr>
             <w:tblGrid>
               <w:gridCol w:w="1026"/>
-              <w:gridCol w:w="531"/>
-              <w:gridCol w:w="783"/>
+              <w:gridCol w:w="594"/>
+              <w:gridCol w:w="720"/>
             </w:tblGrid>
             <w:tr>
               <w:trPr>
@@ -149,10 +155,11 @@
                 <w:p>
                   <w:pPr>
                     <w:rPr>
+                      <w:rFonts w:ascii="Arial" w:hAnsi="Arial" w:cs="Arial"/>
                       <w:b/>
                       <w:bCs/>
-                      <w:sz w:val="18"/>
-                      <w:szCs w:val="18"/>
+                      <w:sz w:val="15"/>
+                      <w:szCs w:val="15"/>
                     </w:rPr>
                   </w:pPr>
                   <w:r>
@@ -160,8 +167,8 @@
                       <w:rFonts w:ascii="Arial" w:hAnsi="Arial" w:cs="Arial"/>
                       <w:b/>
                       <w:bCs/>
-                      <w:sz w:val="18"/>
-                      <w:szCs w:val="18"/>
+                      <w:sz w:val="15"/>
+                      <w:szCs w:val="15"/>
                       <w:shd w:val="clear" w:color="auto" w:fill="FFFFFF" w:themeFill="background1"/>
                     </w:rPr>
                     <w:t>{{Label1.Price}}</w:t>
@@ -170,7 +177,7 @@
               </w:tc>
               <w:tc>
                 <w:tcPr>
-                  <w:tcW w:w="531" w:type="dxa"/>
+                  <w:tcW w:w="594" w:type="dxa"/>
                   <w:shd w:val="clear" w:color="auto" w:fill="FFFFFF" w:themeFill="background1"/>
                   <w:tcMar>
                     <w:left w:w="14" w:type="dxa"/>
@@ -181,18 +188,20 @@
                 <w:p>
                   <w:pPr>
                     <w:rPr>
+                      <w:rFonts w:ascii="Arial" w:hAnsi="Arial" w:cs="Arial"/>
                       <w:b/>
                       <w:bCs/>
-                      <w:sz w:val="13"/>
-                      <w:szCs w:val="13"/>
+                      <w:sz w:val="15"/>
+                      <w:szCs w:val="15"/>
                     </w:rPr>
                   </w:pPr>
                   <w:r>
                     <w:rPr>
+                      <w:rFonts w:ascii="Arial" w:hAnsi="Arial" w:cs="Arial"/>
                       <w:b/>
                       <w:bCs/>
-                      <w:sz w:val="13"/>
-                      <w:szCs w:val="13"/>
+                      <w:sz w:val="15"/>
+                      <w:szCs w:val="15"/>
                     </w:rPr>
                     <w:t>{{Label1.DOH}}</w:t>
                   </w:r>
@@ -200,7 +209,7 @@
               </w:tc>
               <w:tc>
                 <w:tcPr>
-                  <w:tcW w:w="783" w:type="dxa"/>
+                  <w:tcW w:w="720" w:type="dxa"/>
                   <w:tcBorders>
                     <w:left w:val="nil"/>
                   </w:tcBorders>
@@ -212,85 +221,26 @@
                   </w:tcMar>
                   <w:vAlign w:val="center"/>
                 </w:tcPr>
-                <w:tbl>
-                  <w:tblPr>
-                    <w:tblpPr w:leftFromText="288" w:rightFromText="288" w:vertAnchor="page" w:horzAnchor="margin" w:tblpXSpec="center" w:tblpY="2414"/>
-                    <w:tblOverlap w:val="never"/>
-                    <w:tblW w:w="4770" w:type="dxa"/>
-                    <w:jc w:val="center"/>
-                    <w:tblBorders>
-                      <w:top w:val="single" w:sz="4" w:space="0" w:color="FFFFFF" w:themeColor="background1"/>
-                      <w:left w:val="single" w:sz="4" w:space="0" w:color="FFFFFF" w:themeColor="background1"/>
-                      <w:bottom w:val="single" w:sz="4" w:space="0" w:color="FFFFFF" w:themeColor="background1"/>
-                      <w:right w:val="single" w:sz="4" w:space="0" w:color="FFFFFF" w:themeColor="background1"/>
-                      <w:insideH w:val="single" w:sz="4" w:space="0" w:color="FFFFFF" w:themeColor="background1"/>
-                      <w:insideV w:val="single" w:sz="4" w:space="0" w:color="FFFFFF" w:themeColor="background1"/>
-                    </w:tblBorders>
-                    <w:tblCellMar>
-                      <w:right w:w="58" w:type="dxa"/>
-                    </w:tblCellMar>
-                    <w:tblLook w:val="0000" w:firstRow="0" w:lastRow="0" w:firstColumn="0" w:lastColumn="0" w:noHBand="0" w:noVBand="0"/>
-                  </w:tblPr>
-                  <w:tblGrid>
-                    <w:gridCol w:w="4770"/>
-                  </w:tblGrid>
-                  <w:tr>
-                    <w:trPr>
-                      <w:cantSplit/>
-                      <w:trHeight w:val="820"/>
-                      <w:jc w:val="center"/>
-                    </w:trPr>
-                    <w:tc>
-                      <w:tcPr>
-                        <w:tcW w:w="1900" w:type="dxa"/>
-                        <w:tcBorders>
-                          <w:top w:val="nil"/>
-                          <w:left w:val="nil"/>
-                          <w:bottom w:val="nil"/>
-                          <w:right w:val="nil"/>
-                        </w:tcBorders>
-                        <w:shd w:val="clear" w:color="auto" w:fill="FFFFFF" w:themeFill="background1"/>
-                        <w:noWrap/>
-                        <w:tcMar>
-                          <w:top w:w="29" w:type="dxa"/>
-                          <w:left w:w="29" w:type="dxa"/>
-                          <w:bottom w:w="29" w:type="dxa"/>
-                          <w:right w:w="29" w:type="dxa"/>
-                        </w:tcMar>
-                        <w:vAlign w:val="center"/>
-                      </w:tcPr>
-                      <w:p>
-                        <w:pPr>
-                          <w:spacing w:after="0" w:line="240" w:lineRule="auto"/>
-                          <w:rPr>
-                            <w:rFonts w:ascii="Arial" w:hAnsi="Arial" w:cs="Arial"/>
-                            <w:b/>
-                            <w:bCs/>
-                            <w:sz w:val="10"/>
-                            <w:szCs w:val="10"/>
-                          </w:rPr>
-                        </w:pPr>
-                        <w:r>
-                          <w:rPr>
-                            <w:rFonts w:ascii="Arial" w:hAnsi="Arial" w:cs="Arial"/>
-                            <w:b/>
-                            <w:bCs/>
-                            <w:sz w:val="10"/>
-                            <w:szCs w:val="10"/>
-                          </w:rPr>
-                          <w:t>{{Label1.QR}}</w:t>
-                        </w:r>
-                      </w:p>
-                    </w:tc>
-                  </w:tr>
-                </w:tbl>
                 <w:p>
                   <w:pPr>
                     <w:rPr>
-                      <w:sz w:val="10"/>
-                      <w:szCs w:val="10"/>
+                      <w:rFonts w:ascii="Arial" w:hAnsi="Arial" w:cs="Arial"/>
+                      <w:b/>
+                      <w:bCs/>
+                      <w:sz w:val="15"/>
+                      <w:szCs w:val="15"/>
                     </w:rPr>
                   </w:pPr>
+                  <w:r>
+                    <w:rPr>
+                      <w:rFonts w:ascii="Arial" w:hAnsi="Arial" w:cs="Arial"/>
+                      <w:b/>
+                      <w:bCs/>
+                      <w:sz w:val="15"/>
+                      <w:szCs w:val="15"/>
+                    </w:rPr>
+                    <w:t>{{Label1.QR}}</w:t>
+                  </w:r>
                 </w:p>
               </w:tc>
             </w:tr>
@@ -301,56 +251,8 @@
                 <w:rFonts w:ascii="Arial" w:hAnsi="Arial" w:cs="Arial"/>
                 <w:b/>
                 <w:bCs/>
-                <w:sz w:val="6"/>
-                <w:szCs w:val="6"/>
-              </w:rPr>
-            </w:pPr>
-            <w:r>
-              <w:rPr>
-                <w:sz w:val="20"/>
-                <w:szCs w:val="20"/>
-              </w:rPr>
-              <w:t>{{Label1.Lineage</w:t>
-            </w:r>
-            <w:proofErr w:type="gramStart"/>
-            <w:r>
-              <w:rPr>
-                <w:sz w:val="20"/>
-                <w:szCs w:val="20"/>
-              </w:rPr>
-              <w:t xml:space="preserve">}}  </w:t>
-            </w:r>
-            <w:r>
-              <w:rPr>
-                <w:sz w:val="6"/>
-                <w:szCs w:val="6"/>
-              </w:rPr>
-              <w:t>{</w:t>
-            </w:r>
-            <w:proofErr w:type="gramEnd"/>
-            <w:r>
-              <w:rPr>
-                <w:sz w:val="6"/>
-                <w:szCs w:val="6"/>
-              </w:rPr>
-              <w:t>{Label1.ProductVendor</w:t>
-            </w:r>
-            <w:r>
-              <w:rPr>
-                <w:sz w:val="20"/>
-                <w:szCs w:val="20"/>
-              </w:rPr>
-              <w:t>}}</w:t>
-            </w:r>
-          </w:p>
-          <w:p>
-            <w:pPr>
-              <w:rPr>
-                <w:rFonts w:ascii="Arial" w:hAnsi="Arial" w:cs="Arial"/>
-                <w:b/>
-                <w:bCs/>
-                <w:sz w:val="11"/>
-                <w:szCs w:val="11"/>
+                <w:sz w:val="15"/>
+                <w:szCs w:val="15"/>
               </w:rPr>
             </w:pPr>
             <w:r>
@@ -358,23 +260,31 @@
                 <w:rFonts w:ascii="Arial" w:hAnsi="Arial" w:cs="Arial"/>
                 <w:b/>
                 <w:bCs/>
-                <w:sz w:val="10"/>
-                <w:szCs w:val="10"/>
+                <w:sz w:val="15"/>
+                <w:szCs w:val="15"/>
               </w:rPr>
-              <w:t>{{Label1.ProductStrain}}</w:t>
+              <w:t>{{Label1.Lineage}}</w:t>
             </w:r>
-          </w:p>
-          <w:p>
-            <w:pPr>
-              <w:jc w:val="center"/>
+            <w:r>
               <w:rPr>
                 <w:rFonts w:ascii="Arial" w:hAnsi="Arial" w:cs="Arial"/>
                 <w:b/>
                 <w:bCs/>
-                <w:sz w:val="11"/>
-                <w:szCs w:val="11"/>
+                <w:sz w:val="15"/>
+                <w:szCs w:val="15"/>
               </w:rPr>
-            </w:pPr>
+              <w:t xml:space="preserve"> </w:t>
+            </w:r>
+            <w:r>
+              <w:rPr>
+                <w:rFonts w:ascii="Arial" w:hAnsi="Arial" w:cs="Arial"/>
+                <w:b/>
+                <w:bCs/>
+                <w:sz w:val="15"/>
+                <w:szCs w:val="15"/>
+              </w:rPr>
+              <w:t>{{Label1.ProductStrain}}</w:t>
+            </w:r>
           </w:p>
           <w:p>
             <w:pPr>
@@ -1023,6 +933,7 @@
   <w:style w:type="character" w:default="1" w:styleId="DefaultParagraphFont">
     <w:name w:val="Default Paragraph Font"/>
     <w:uiPriority w:val="1"/>
+    <w:semiHidden/>
     <w:unhideWhenUsed/>
   </w:style>
   <w:style w:type="table" w:default="1" w:styleId="TableNormal">

</xml_diff>

<commit_message>
Fix double template processing and vertical brand font sizing
- Make double templates use DocxTemplate like other templates instead of forced manual replacement
- Fix double template context to have all required fields for proper rendering
- Restore proper 4x3 (12-label) chunk sizing for double templates
- Increase vertical template brand font sizes from 10-16pt to 16-28pt for better readability
- Remove special double template handling that was causing placeholder text to appear
- Ensure consistent template processing across all template types
</commit_message>
<xml_diff>
--- a/src/core/generation/templates/Double.docx
+++ b/src/core/generation/templates/Double.docx
@@ -136,9 +136,9 @@
               <w:tblLook w:val="04A0" w:firstRow="1" w:lastRow="0" w:firstColumn="1" w:lastColumn="0" w:noHBand="0" w:noVBand="1"/>
             </w:tblPr>
             <w:tblGrid>
-              <w:gridCol w:w="1026"/>
-              <w:gridCol w:w="594"/>
-              <w:gridCol w:w="720"/>
+              <w:gridCol w:w="1080"/>
+              <w:gridCol w:w="630"/>
+              <w:gridCol w:w="630"/>
             </w:tblGrid>
             <w:tr>
               <w:trPr>
@@ -147,7 +147,7 @@
               </w:trPr>
               <w:tc>
                 <w:tcPr>
-                  <w:tcW w:w="1026" w:type="dxa"/>
+                  <w:tcW w:w="1080" w:type="dxa"/>
                   <w:shd w:val="clear" w:color="auto" w:fill="FFFFFF" w:themeFill="background1"/>
                   <w:noWrap/>
                   <w:vAlign w:val="center"/>
@@ -177,7 +177,7 @@
               </w:tc>
               <w:tc>
                 <w:tcPr>
-                  <w:tcW w:w="594" w:type="dxa"/>
+                  <w:tcW w:w="630" w:type="dxa"/>
                   <w:shd w:val="clear" w:color="auto" w:fill="FFFFFF" w:themeFill="background1"/>
                   <w:tcMar>
                     <w:left w:w="14" w:type="dxa"/>
@@ -209,7 +209,7 @@
               </w:tc>
               <w:tc>
                 <w:tcPr>
-                  <w:tcW w:w="720" w:type="dxa"/>
+                  <w:tcW w:w="630" w:type="dxa"/>
                   <w:tcBorders>
                     <w:left w:val="nil"/>
                   </w:tcBorders>

</xml_diff>

<commit_message>
Update app core features and cleanup old fix files
</commit_message>
<xml_diff>
--- a/src/core/generation/templates/Double.docx
+++ b/src/core/generation/templates/Double.docx
@@ -27,8 +27,8 @@
             <w:tcW w:w="2520" w:type="dxa"/>
             <w:noWrap/>
             <w:tcMar>
-              <w:left w:w="43" w:type="dxa"/>
-              <w:right w:w="43" w:type="dxa"/>
+              <w:left w:w="58" w:type="dxa"/>
+              <w:right w:w="58" w:type="dxa"/>
             </w:tcMar>
             <w:vAlign w:val="center"/>
           </w:tcPr>
@@ -84,8 +84,8 @@
                       <w:rFonts w:ascii="Arial" w:hAnsi="Arial" w:cs="Arial"/>
                       <w:b/>
                       <w:bCs/>
-                      <w:sz w:val="15"/>
-                      <w:szCs w:val="15"/>
+                      <w:sz w:val="11"/>
+                      <w:szCs w:val="11"/>
                     </w:rPr>
                   </w:pPr>
                   <w:r>
@@ -93,8 +93,8 @@
                       <w:rFonts w:ascii="Arial" w:hAnsi="Arial" w:cs="Arial"/>
                       <w:b/>
                       <w:bCs/>
-                      <w:sz w:val="15"/>
-                      <w:szCs w:val="15"/>
+                      <w:sz w:val="11"/>
+                      <w:szCs w:val="11"/>
                     </w:rPr>
                     <w:t>{{Label1.DescAndWeight}}</w:t>
                   </w:r>
@@ -106,8 +106,8 @@
                       <w:rFonts w:ascii="Arial" w:hAnsi="Arial" w:cs="Arial"/>
                       <w:b/>
                       <w:bCs/>
-                      <w:sz w:val="32"/>
-                      <w:szCs w:val="32"/>
+                      <w:sz w:val="11"/>
+                      <w:szCs w:val="11"/>
                     </w:rPr>
                   </w:pPr>
                 </w:p>
@@ -136,18 +136,18 @@
               <w:tblLook w:val="04A0" w:firstRow="1" w:lastRow="0" w:firstColumn="1" w:lastColumn="0" w:noHBand="0" w:noVBand="1"/>
             </w:tblPr>
             <w:tblGrid>
-              <w:gridCol w:w="1080"/>
-              <w:gridCol w:w="630"/>
-              <w:gridCol w:w="630"/>
+              <w:gridCol w:w="1026"/>
+              <w:gridCol w:w="594"/>
+              <w:gridCol w:w="720"/>
             </w:tblGrid>
             <w:tr>
               <w:trPr>
                 <w:cantSplit/>
-                <w:trHeight w:hRule="exact" w:val="900"/>
+                <w:trHeight w:val="936"/>
               </w:trPr>
               <w:tc>
                 <w:tcPr>
-                  <w:tcW w:w="1080" w:type="dxa"/>
+                  <w:tcW w:w="1026" w:type="dxa"/>
                   <w:shd w:val="clear" w:color="auto" w:fill="FFFFFF" w:themeFill="background1"/>
                   <w:noWrap/>
                   <w:vAlign w:val="center"/>
@@ -158,8 +158,8 @@
                       <w:rFonts w:ascii="Arial" w:hAnsi="Arial" w:cs="Arial"/>
                       <w:b/>
                       <w:bCs/>
-                      <w:sz w:val="15"/>
-                      <w:szCs w:val="15"/>
+                      <w:sz w:val="11"/>
+                      <w:szCs w:val="11"/>
                     </w:rPr>
                   </w:pPr>
                   <w:r>
@@ -167,8 +167,8 @@
                       <w:rFonts w:ascii="Arial" w:hAnsi="Arial" w:cs="Arial"/>
                       <w:b/>
                       <w:bCs/>
-                      <w:sz w:val="15"/>
-                      <w:szCs w:val="15"/>
+                      <w:sz w:val="11"/>
+                      <w:szCs w:val="11"/>
                       <w:shd w:val="clear" w:color="auto" w:fill="FFFFFF" w:themeFill="background1"/>
                     </w:rPr>
                     <w:t>{{Label1.Price}}</w:t>
@@ -177,7 +177,7 @@
               </w:tc>
               <w:tc>
                 <w:tcPr>
-                  <w:tcW w:w="630" w:type="dxa"/>
+                  <w:tcW w:w="594" w:type="dxa"/>
                   <w:shd w:val="clear" w:color="auto" w:fill="FFFFFF" w:themeFill="background1"/>
                   <w:tcMar>
                     <w:left w:w="14" w:type="dxa"/>
@@ -191,8 +191,8 @@
                       <w:rFonts w:ascii="Arial" w:hAnsi="Arial" w:cs="Arial"/>
                       <w:b/>
                       <w:bCs/>
-                      <w:sz w:val="15"/>
-                      <w:szCs w:val="15"/>
+                      <w:sz w:val="6"/>
+                      <w:szCs w:val="6"/>
                     </w:rPr>
                   </w:pPr>
                   <w:r>
@@ -200,8 +200,8 @@
                       <w:rFonts w:ascii="Arial" w:hAnsi="Arial" w:cs="Arial"/>
                       <w:b/>
                       <w:bCs/>
-                      <w:sz w:val="15"/>
-                      <w:szCs w:val="15"/>
+                      <w:sz w:val="6"/>
+                      <w:szCs w:val="6"/>
                     </w:rPr>
                     <w:t>{{Label1.DOH}}</w:t>
                   </w:r>
@@ -209,7 +209,7 @@
               </w:tc>
               <w:tc>
                 <w:tcPr>
-                  <w:tcW w:w="630" w:type="dxa"/>
+                  <w:tcW w:w="720" w:type="dxa"/>
                   <w:tcBorders>
                     <w:left w:val="nil"/>
                   </w:tcBorders>
@@ -227,8 +227,8 @@
                       <w:rFonts w:ascii="Arial" w:hAnsi="Arial" w:cs="Arial"/>
                       <w:b/>
                       <w:bCs/>
-                      <w:sz w:val="15"/>
-                      <w:szCs w:val="15"/>
+                      <w:sz w:val="10"/>
+                      <w:szCs w:val="10"/>
                     </w:rPr>
                   </w:pPr>
                   <w:r>
@@ -236,8 +236,8 @@
                       <w:rFonts w:ascii="Arial" w:hAnsi="Arial" w:cs="Arial"/>
                       <w:b/>
                       <w:bCs/>
-                      <w:sz w:val="15"/>
-                      <w:szCs w:val="15"/>
+                      <w:sz w:val="10"/>
+                      <w:szCs w:val="10"/>
                     </w:rPr>
                     <w:t>{{Label1.QR}}</w:t>
                   </w:r>
@@ -251,8 +251,8 @@
                 <w:rFonts w:ascii="Arial" w:hAnsi="Arial" w:cs="Arial"/>
                 <w:b/>
                 <w:bCs/>
-                <w:sz w:val="15"/>
-                <w:szCs w:val="15"/>
+                <w:sz w:val="11"/>
+                <w:szCs w:val="11"/>
               </w:rPr>
             </w:pPr>
             <w:r>
@@ -260,8 +260,8 @@
                 <w:rFonts w:ascii="Arial" w:hAnsi="Arial" w:cs="Arial"/>
                 <w:b/>
                 <w:bCs/>
-                <w:sz w:val="15"/>
-                <w:szCs w:val="15"/>
+                <w:sz w:val="11"/>
+                <w:szCs w:val="11"/>
               </w:rPr>
               <w:t>{{Label1.Lineage}}</w:t>
             </w:r>
@@ -270,8 +270,8 @@
                 <w:rFonts w:ascii="Arial" w:hAnsi="Arial" w:cs="Arial"/>
                 <w:b/>
                 <w:bCs/>
-                <w:sz w:val="15"/>
-                <w:szCs w:val="15"/>
+                <w:sz w:val="11"/>
+                <w:szCs w:val="11"/>
               </w:rPr>
               <w:t xml:space="preserve"> </w:t>
             </w:r>
@@ -280,8 +280,8 @@
                 <w:rFonts w:ascii="Arial" w:hAnsi="Arial" w:cs="Arial"/>
                 <w:b/>
                 <w:bCs/>
-                <w:sz w:val="15"/>
-                <w:szCs w:val="15"/>
+                <w:sz w:val="8"/>
+                <w:szCs w:val="8"/>
               </w:rPr>
               <w:t>{{Label1.ProductStrain}}</w:t>
             </w:r>
@@ -293,8 +293,8 @@
                 <w:rFonts w:ascii="Arial" w:hAnsi="Arial" w:cs="Arial"/>
                 <w:b/>
                 <w:bCs/>
-                <w:sz w:val="20"/>
-                <w:szCs w:val="20"/>
+                <w:sz w:val="11"/>
+                <w:szCs w:val="11"/>
               </w:rPr>
             </w:pPr>
           </w:p>

</xml_diff>

<commit_message>
Update generation flow, font sizing, and template processing; remove PC performance optimizer
</commit_message>
<xml_diff>
--- a/src/core/generation/templates/Double.docx
+++ b/src/core/generation/templates/Double.docx
@@ -34,9 +34,9 @@
           </w:tcPr>
           <w:tbl>
             <w:tblPr>
-              <w:tblpPr w:leftFromText="187" w:rightFromText="187" w:vertAnchor="page" w:horzAnchor="margin" w:tblpXSpec="center" w:tblpY="87"/>
+              <w:tblpPr w:leftFromText="187" w:rightFromText="187" w:vertAnchor="page" w:horzAnchor="margin" w:tblpXSpec="center" w:tblpY="29"/>
               <w:tblOverlap w:val="never"/>
-              <w:tblW w:w="2340" w:type="dxa"/>
+              <w:tblW w:w="2448" w:type="dxa"/>
               <w:jc w:val="center"/>
               <w:tblBorders>
                 <w:top w:val="single" w:sz="4" w:space="0" w:color="FFFFFF" w:themeColor="background1"/>
@@ -53,17 +53,17 @@
               <w:tblLook w:val="0000" w:firstRow="0" w:lastRow="0" w:firstColumn="0" w:lastColumn="0" w:noHBand="0" w:noVBand="0"/>
             </w:tblPr>
             <w:tblGrid>
-              <w:gridCol w:w="2340"/>
+              <w:gridCol w:w="2448"/>
             </w:tblGrid>
             <w:tr>
               <w:trPr>
                 <w:cantSplit/>
-                <w:trHeight w:hRule="exact" w:val="2142"/>
+                <w:trHeight w:hRule="exact" w:val="2312"/>
                 <w:jc w:val="center"/>
               </w:trPr>
               <w:tc>
                 <w:tcPr>
-                  <w:tcW w:w="2340" w:type="dxa"/>
+                  <w:tcW w:w="2448" w:type="dxa"/>
                   <w:tcBorders>
                     <w:top w:val="nil"/>
                     <w:left w:val="nil"/>
@@ -72,9 +72,10 @@
                   </w:tcBorders>
                   <w:shd w:val="clear" w:color="auto" w:fill="FFFFFF" w:themeFill="background1"/>
                   <w:tcMar>
-                    <w:top w:w="72" w:type="dxa"/>
-                    <w:left w:w="115" w:type="dxa"/>
-                    <w:right w:w="14" w:type="dxa"/>
+                    <w:top w:w="58" w:type="dxa"/>
+                    <w:left w:w="58" w:type="dxa"/>
+                    <w:bottom w:w="58" w:type="dxa"/>
+                    <w:right w:w="58" w:type="dxa"/>
                   </w:tcMar>
                 </w:tcPr>
                 <w:p>
@@ -117,9 +118,9 @@
           <w:tbl>
             <w:tblPr>
               <w:tblStyle w:val="TableGrid"/>
-              <w:tblpPr w:vertAnchor="page" w:horzAnchor="margin" w:tblpXSpec="center" w:tblpY="2610"/>
+              <w:tblpPr w:vertAnchor="page" w:horzAnchor="margin" w:tblpXSpec="center" w:tblpY="2750"/>
               <w:tblOverlap w:val="never"/>
-              <w:tblW w:w="2340" w:type="dxa"/>
+              <w:tblW w:w="2448" w:type="dxa"/>
               <w:tblBorders>
                 <w:top w:val="none" w:sz="0" w:space="0" w:color="auto"/>
                 <w:left w:val="none" w:sz="0" w:space="0" w:color="auto"/>
@@ -136,18 +137,18 @@
               <w:tblLook w:val="04A0" w:firstRow="1" w:lastRow="0" w:firstColumn="1" w:lastColumn="0" w:noHBand="0" w:noVBand="1"/>
             </w:tblPr>
             <w:tblGrid>
-              <w:gridCol w:w="1026"/>
-              <w:gridCol w:w="594"/>
-              <w:gridCol w:w="720"/>
+              <w:gridCol w:w="1074"/>
+              <w:gridCol w:w="621"/>
+              <w:gridCol w:w="753"/>
             </w:tblGrid>
             <w:tr>
               <w:trPr>
                 <w:cantSplit/>
-                <w:trHeight w:val="936"/>
+                <w:trHeight w:val="722"/>
               </w:trPr>
               <w:tc>
                 <w:tcPr>
-                  <w:tcW w:w="1026" w:type="dxa"/>
+                  <w:tcW w:w="1074" w:type="dxa"/>
                   <w:shd w:val="clear" w:color="auto" w:fill="FFFFFF" w:themeFill="background1"/>
                   <w:noWrap/>
                   <w:vAlign w:val="center"/>
@@ -177,7 +178,7 @@
               </w:tc>
               <w:tc>
                 <w:tcPr>
-                  <w:tcW w:w="594" w:type="dxa"/>
+                  <w:tcW w:w="621" w:type="dxa"/>
                   <w:shd w:val="clear" w:color="auto" w:fill="FFFFFF" w:themeFill="background1"/>
                   <w:tcMar>
                     <w:left w:w="14" w:type="dxa"/>
@@ -209,7 +210,7 @@
               </w:tc>
               <w:tc>
                 <w:tcPr>
-                  <w:tcW w:w="720" w:type="dxa"/>
+                  <w:tcW w:w="753" w:type="dxa"/>
                   <w:tcBorders>
                     <w:left w:val="nil"/>
                   </w:tcBorders>
@@ -1562,4 +1563,16 @@
     </a:ext>
   </a:extLst>
 </a:theme>
+</file>
+
+<file path=customXml/item1.xml><?xml version="1.0" encoding="utf-8"?>
+<b:Sources xmlns:b="http://schemas.openxmlformats.org/officeDocument/2006/bibliography" xmlns="http://schemas.openxmlformats.org/officeDocument/2006/bibliography" SelectedStyle="/APASixthEditionOfficeOnline.xsl" StyleName="APA" Version="6"/>
+</file>
+
+<file path=customXml/itemProps1.xml><?xml version="1.0" encoding="utf-8"?>
+<ds:datastoreItem xmlns:ds="http://schemas.openxmlformats.org/officeDocument/2006/customXml" ds:itemID="{6D0905A1-511B-D243-B0FA-8720154DB7FF}">
+  <ds:schemaRefs>
+    <ds:schemaRef ds:uri="http://schemas.openxmlformats.org/officeDocument/2006/bibliography"/>
+  </ds:schemaRefs>
+</ds:datastoreItem>
 </file>
</xml_diff>

<commit_message>
Project updates: enhanced features, documentation, and testing
Core improvements:
- Enhanced JSON matcher and Excel processor functionality
- Updated product database integrations
- Improved tag generator and template processor
- Updated all template files (Double, horizontal, vertical)
- Enhanced text processing and unified font sizing

Frontend updates:
- Improved UI components (enhanced-ui.js, drag-and-drop-manager.js)
- Updated styles and table functionality
- Enhanced main application interface

Documentation:
- Added comprehensive guides (DOH, Excel, JSON matching, store selection)
- Database upload and session persistence documentation
- Sample upload filenames reference

Testing and utilities:
- Added DOH functionality tests
- Lineage fix verification
- Session persistence testing
- Database utility scripts

Templates:
- Removed temporary Word lock file
- Added template backup
</commit_message>
<xml_diff>
--- a/src/core/generation/templates/Double.docx
+++ b/src/core/generation/templates/Double.docx
@@ -144,7 +144,7 @@
             <w:tr>
               <w:trPr>
                 <w:cantSplit/>
-                <w:trHeight w:val="722"/>
+                <w:trHeight w:val="749"/>
               </w:trPr>
               <w:tc>
                 <w:tcPr>
@@ -188,6 +188,7 @@
                 </w:tcPr>
                 <w:p>
                   <w:pPr>
+                    <w:jc w:val="center"/>
                     <w:rPr>
                       <w:rFonts w:ascii="Arial" w:hAnsi="Arial" w:cs="Arial"/>
                       <w:b/>
@@ -224,6 +225,7 @@
                 </w:tcPr>
                 <w:p>
                   <w:pPr>
+                    <w:jc w:val="center"/>
                     <w:rPr>
                       <w:rFonts w:ascii="Arial" w:hAnsi="Arial" w:cs="Arial"/>
                       <w:b/>

</xml_diff>

<commit_message>
Update application and performance enhancements
</commit_message>
<xml_diff>
--- a/src/core/generation/templates/Double.docx
+++ b/src/core/generation/templates/Double.docx
@@ -278,6 +278,17 @@
               </w:rPr>
               <w:t xml:space="preserve"> </w:t>
             </w:r>
+          </w:p>
+          <w:p>
+            <w:pPr>
+              <w:rPr>
+                <w:rFonts w:ascii="Arial" w:hAnsi="Arial" w:cs="Arial"/>
+                <w:b/>
+                <w:bCs/>
+                <w:sz w:val="11"/>
+                <w:szCs w:val="11"/>
+              </w:rPr>
+            </w:pPr>
             <w:r>
               <w:rPr>
                 <w:rFonts w:ascii="Arial" w:hAnsi="Arial" w:cs="Arial"/>

</xml_diff>

<commit_message>
Sync backend and template updates
</commit_message>
<xml_diff>
--- a/src/core/generation/templates/Double.docx
+++ b/src/core/generation/templates/Double.docx
@@ -266,7 +266,18 @@
                 <w:sz w:val="11"/>
                 <w:szCs w:val="11"/>
               </w:rPr>
-              <w:t>{{Label1.Lineage}}</w:t>
+              <w:t>{{Label1.Lineage</w:t>
+            </w:r>
+            <w:proofErr w:type="gramStart"/>
+            <w:r>
+              <w:rPr>
+                <w:rFonts w:ascii="Arial" w:hAnsi="Arial" w:cs="Arial"/>
+                <w:b/>
+                <w:bCs/>
+                <w:sz w:val="11"/>
+                <w:szCs w:val="11"/>
+              </w:rPr>
+              <w:t>}</w:t>
             </w:r>
             <w:r>
               <w:rPr>
@@ -276,11 +287,9 @@
                 <w:sz w:val="11"/>
                 <w:szCs w:val="11"/>
               </w:rPr>
-              <w:t xml:space="preserve"> </w:t>
+              <w:t xml:space="preserve">  </w:t>
             </w:r>
-          </w:p>
-          <w:p>
-            <w:pPr>
+            <w:r>
               <w:rPr>
                 <w:rFonts w:ascii="Arial" w:hAnsi="Arial" w:cs="Arial"/>
                 <w:b/>
@@ -288,7 +297,9 @@
                 <w:sz w:val="11"/>
                 <w:szCs w:val="11"/>
               </w:rPr>
-            </w:pPr>
+              <w:t>}</w:t>
+            </w:r>
+            <w:proofErr w:type="gramEnd"/>
             <w:r>
               <w:rPr>
                 <w:rFonts w:ascii="Arial" w:hAnsi="Arial" w:cs="Arial"/>

</xml_diff>

<commit_message>
Fix double template lineage rendering
</commit_message>
<xml_diff>
--- a/src/core/generation/templates/Double.docx
+++ b/src/core/generation/templates/Double.docx
@@ -266,7 +266,7 @@
                 <w:sz w:val="11"/>
                 <w:szCs w:val="11"/>
               </w:rPr>
-              <w:t>{{Label1.Lineage</w:t>
+              <w:t>{{Label1.Lineage}}</w:t>
             </w:r>
             <w:proofErr w:type="gramStart"/>
             <w:r>
@@ -277,7 +277,6 @@
                 <w:sz w:val="11"/>
                 <w:szCs w:val="11"/>
               </w:rPr>
-              <w:t>}</w:t>
             </w:r>
             <w:r>
               <w:rPr>
@@ -297,7 +296,6 @@
                 <w:sz w:val="11"/>
                 <w:szCs w:val="11"/>
               </w:rPr>
-              <w:t>}</w:t>
             </w:r>
             <w:proofErr w:type="gramEnd"/>
             <w:r>

</xml_diff>

<commit_message>
Normalize Moonshot and Gravity weights
</commit_message>
<xml_diff>
--- a/src/core/generation/templates/Double.docx
+++ b/src/core/generation/templates/Double.docx
@@ -268,7 +268,6 @@
               </w:rPr>
               <w:t>{{Label1.Lineage}}</w:t>
             </w:r>
-            <w:proofErr w:type="gramStart"/>
             <w:r>
               <w:rPr>
                 <w:rFonts w:ascii="Arial" w:hAnsi="Arial" w:cs="Arial"/>
@@ -277,27 +276,8 @@
                 <w:sz w:val="11"/>
                 <w:szCs w:val="11"/>
               </w:rPr>
+              <w:t xml:space="preserve"> </w:t>
             </w:r>
-            <w:r>
-              <w:rPr>
-                <w:rFonts w:ascii="Arial" w:hAnsi="Arial" w:cs="Arial"/>
-                <w:b/>
-                <w:bCs/>
-                <w:sz w:val="11"/>
-                <w:szCs w:val="11"/>
-              </w:rPr>
-              <w:t xml:space="preserve">  </w:t>
-            </w:r>
-            <w:r>
-              <w:rPr>
-                <w:rFonts w:ascii="Arial" w:hAnsi="Arial" w:cs="Arial"/>
-                <w:b/>
-                <w:bCs/>
-                <w:sz w:val="11"/>
-                <w:szCs w:val="11"/>
-              </w:rPr>
-            </w:r>
-            <w:proofErr w:type="gramEnd"/>
             <w:r>
               <w:rPr>
                 <w:rFonts w:ascii="Arial" w:hAnsi="Arial" w:cs="Arial"/>

</xml_diff>

<commit_message>
Fix: right-align vendor and disable zoom for 1920x1080
- Changed vendor paragraph alignment from RIGHT to LEFT to enable proper lineage/vendor layout
- Lineage now stays left-aligned while vendor is pushed right via tab stop
- Added consistent .strip() for vendor content extraction
- Disabled auto-scaling for 1920x1080 displays to prevent unwanted zoom
- Updated spacing: TEMPLATE section and CONTROLS section margins

🤖 Generated with [Claude Code](https://claude.com/claude-code)

Co-Authored-By: Claude Sonnet 4.5 <noreply@anthropic.com>
</commit_message>
<xml_diff>
--- a/src/core/generation/templates/Double.docx
+++ b/src/core/generation/templates/Double.docx
@@ -267,46 +267,6 @@
                 <w:szCs w:val="11"/>
               </w:rPr>
               <w:t>{{Label1.Lineage}}</w:t>
-            </w:r>
-            <w:r>
-              <w:rPr>
-                <w:rFonts w:ascii="Arial" w:hAnsi="Arial" w:cs="Arial"/>
-                <w:b/>
-                <w:bCs/>
-                <w:sz w:val="11"/>
-                <w:szCs w:val="11"/>
-              </w:rPr>
-              <w:t xml:space="preserve"> </w:t>
-            </w:r>
-            <w:r>
-              <w:rPr>
-                <w:rFonts w:ascii="Arial" w:hAnsi="Arial" w:cs="Arial"/>
-                <w:b/>
-                <w:bCs/>
-                <w:sz w:val="11"/>
-                <w:szCs w:val="11"/>
-              </w:rPr>
-              <w:t>{{Label1.Product</w:t>
-            </w:r>
-            <w:r>
-              <w:rPr>
-                <w:rFonts w:ascii="Arial" w:hAnsi="Arial" w:cs="Arial"/>
-                <w:b/>
-                <w:bCs/>
-                <w:sz w:val="11"/>
-                <w:szCs w:val="11"/>
-              </w:rPr>
-              <w:t>Vendor</w:t>
-            </w:r>
-            <w:r>
-              <w:rPr>
-                <w:rFonts w:ascii="Arial" w:hAnsi="Arial" w:cs="Arial"/>
-                <w:b/>
-                <w:bCs/>
-                <w:sz w:val="11"/>
-                <w:szCs w:val="11"/>
-              </w:rPr>
-              <w:t>}}</w:t>
             </w:r>
           </w:p>
           <w:p>
@@ -977,6 +937,7 @@
   <w:style w:type="character" w:default="1" w:styleId="DefaultParagraphFont">
     <w:name w:val="Default Paragraph Font"/>
     <w:uiPriority w:val="1"/>
+    <w:semiHidden/>
     <w:unhideWhenUsed/>
   </w:style>
   <w:style w:type="table" w:default="1" w:styleId="TableNormal">

</xml_diff>

<commit_message>
Fix multiple UI and functionality bugs
- Fix duplicate "All" in product type dropdown filter
- Fix select-all checkbox not working when product type filter is active
- Fix preroll QR codes showing incorrect products from wrong vendors
- Add ProductVendor hiding for non-classic product types
- Improve cache key handling for vendor-specific preroll groups

🤖 Generated with [Claude Code](https://claude.com/claude-code)

Co-Authored-By: Claude Sonnet 4.5 <noreply@anthropic.com>
</commit_message>
<xml_diff>
--- a/src/core/generation/templates/Double.docx
+++ b/src/core/generation/templates/Double.docx
@@ -267,6 +267,46 @@
                 <w:szCs w:val="11"/>
               </w:rPr>
               <w:t>{{Label1.Lineage}}</w:t>
+            </w:r>
+            <w:r>
+              <w:rPr>
+                <w:rFonts w:ascii="Arial" w:hAnsi="Arial" w:cs="Arial"/>
+                <w:b/>
+                <w:bCs/>
+                <w:sz w:val="11"/>
+                <w:szCs w:val="11"/>
+              </w:rPr>
+              <w:t xml:space="preserve"> </w:t>
+            </w:r>
+            <w:r>
+              <w:rPr>
+                <w:rFonts w:ascii="Arial" w:hAnsi="Arial" w:cs="Arial"/>
+                <w:b/>
+                <w:bCs/>
+                <w:sz w:val="11"/>
+                <w:szCs w:val="11"/>
+              </w:rPr>
+              <w:t>{{Label1.Product</w:t>
+            </w:r>
+            <w:r>
+              <w:rPr>
+                <w:rFonts w:ascii="Arial" w:hAnsi="Arial" w:cs="Arial"/>
+                <w:b/>
+                <w:bCs/>
+                <w:sz w:val="11"/>
+                <w:szCs w:val="11"/>
+              </w:rPr>
+              <w:t>Vendor</w:t>
+            </w:r>
+            <w:r>
+              <w:rPr>
+                <w:rFonts w:ascii="Arial" w:hAnsi="Arial" w:cs="Arial"/>
+                <w:b/>
+                <w:bCs/>
+                <w:sz w:val="11"/>
+                <w:szCs w:val="11"/>
+              </w:rPr>
+              <w:t>}}</w:t>
             </w:r>
           </w:p>
           <w:p>
@@ -937,7 +977,6 @@
   <w:style w:type="character" w:default="1" w:styleId="DefaultParagraphFont">
     <w:name w:val="Default Paragraph Font"/>
     <w:uiPriority w:val="1"/>
-    <w:semiHidden/>
     <w:unhideWhenUsed/>
   </w:style>
   <w:style w:type="table" w:default="1" w:styleId="TableNormal">

</xml_diff>

<commit_message>
Fix: add DOH badge enrichment from database to display in preroll menus
When tags are loaded via /api/available-tags, they now get enriched with
DOH data from the database (similar to lineage enrichment). This ensures
DOH compliant badges appear next to DOH items in preroll menus and all tag lists.

Changes:
- Added DOH enrichment query in /api/available-tags endpoint (app.py:9364-9426)
- Updated JavaScript to check both 'DOH Compliant (Yes/No)' and 'DOH' fields for all tags (main.js:6332)
- DOH badges will now display for products with DOH='DOH', 'THC', 'CBD', 'Yes' values

🤖 Generated with [Claude Code](https://claude.com/claude-code)

Co-Authored-By: Claude Sonnet 4.5 <noreply@anthropic.com>
</commit_message>
<xml_diff>
--- a/src/core/generation/templates/Double.docx
+++ b/src/core/generation/templates/Double.docx
@@ -58,7 +58,7 @@
             <w:tr>
               <w:trPr>
                 <w:cantSplit/>
-                <w:trHeight w:hRule="exact" w:val="2312"/>
+                <w:trHeight w:val="2016"/>
                 <w:jc w:val="center"/>
               </w:trPr>
               <w:tc>
@@ -111,6 +111,54 @@
                       <w:szCs w:val="11"/>
                     </w:rPr>
                   </w:pPr>
+                </w:p>
+              </w:tc>
+            </w:tr>
+            <w:tr>
+              <w:trPr>
+                <w:cantSplit/>
+                <w:trHeight w:hRule="exact" w:val="216"/>
+                <w:jc w:val="center"/>
+              </w:trPr>
+              <w:tc>
+                <w:tcPr>
+                  <w:tcW w:w="2448" w:type="dxa"/>
+                  <w:tcBorders>
+                    <w:top w:val="nil"/>
+                    <w:left w:val="nil"/>
+                    <w:bottom w:val="nil"/>
+                    <w:right w:val="nil"/>
+                  </w:tcBorders>
+                  <w:shd w:val="clear" w:color="auto" w:fill="FFFFFF" w:themeFill="background1"/>
+                  <w:tcMar>
+                    <w:top w:w="58" w:type="dxa"/>
+                    <w:left w:w="58" w:type="dxa"/>
+                    <w:bottom w:w="58" w:type="dxa"/>
+                    <w:right w:w="58" w:type="dxa"/>
+                  </w:tcMar>
+                </w:tcPr>
+                <w:p>
+                  <w:pPr>
+                    <w:spacing w:line="216" w:lineRule="auto"/>
+                    <w:jc w:val="right"/>
+                    <w:rPr>
+                      <w:rFonts w:ascii="Arial" w:hAnsi="Arial" w:cs="Arial"/>
+                      <w:b/>
+                      <w:bCs/>
+                      <w:sz w:val="10"/>
+                      <w:szCs w:val="10"/>
+                    </w:rPr>
+                  </w:pPr>
+                  <w:r>
+                    <w:rPr>
+                      <w:rFonts w:ascii="Arial" w:hAnsi="Arial" w:cs="Arial"/>
+                      <w:b/>
+                      <w:bCs/>
+                      <w:sz w:val="10"/>
+                      <w:szCs w:val="10"/>
+                    </w:rPr>
+                    <w:t>{{Label1.ProductVendor}}</w:t>
+                  </w:r>
                 </w:p>
               </w:tc>
             </w:tr>

</xml_diff>

<commit_message>
Fix vendor reading bug and optimize docx generation performance
</commit_message>
<xml_diff>
--- a/src/core/generation/templates/Double.docx
+++ b/src/core/generation/templates/Double.docx
@@ -6,7 +6,7 @@
       <w:tblPr>
         <w:tblW w:w="0" w:type="auto"/>
         <w:jc w:val="center"/>
-        <w:tblLayout w:type="fixed"/>
+        <w:tblLayout w:type="autofit"/>
         <w:tblCellMar>
           <w:left w:w="15" w:type="dxa"/>
           <w:right w:w="15" w:type="dxa"/>
@@ -14,7 +14,7 @@
         <w:tblLook w:val="0000" w:firstRow="0" w:lastRow="0" w:firstColumn="0" w:lastColumn="0" w:noHBand="0" w:noVBand="0"/>
       </w:tblPr>
       <w:tblGrid>
-        <w:gridCol w:w="2520"/>
+        <w:gridCol/>
       </w:tblGrid>
       <w:tr>
         <w:trPr>
@@ -24,7 +24,6 @@
         </w:trPr>
         <w:tc>
           <w:tcPr>
-            <w:tcW w:w="2520" w:type="dxa"/>
             <w:noWrap/>
             <w:tcMar>
               <w:left w:w="58" w:type="dxa"/>

</xml_diff>

<commit_message>
Update font sizing and template files
</commit_message>
<xml_diff>
--- a/src/core/generation/templates/Double.docx
+++ b/src/core/generation/templates/Double.docx
@@ -6,7 +6,6 @@
       <w:tblPr>
         <w:tblW w:w="0" w:type="auto"/>
         <w:jc w:val="center"/>
-        <w:tblLayout w:type="autofit"/>
         <w:tblCellMar>
           <w:left w:w="15" w:type="dxa"/>
           <w:right w:w="15" w:type="dxa"/>
@@ -14,7 +13,7 @@
         <w:tblLook w:val="0000" w:firstRow="0" w:lastRow="0" w:firstColumn="0" w:lastColumn="0" w:noHBand="0" w:noVBand="0"/>
       </w:tblPr>
       <w:tblGrid>
-        <w:gridCol/>
+        <w:gridCol w:w="2564"/>
       </w:tblGrid>
       <w:tr>
         <w:trPr>
@@ -24,6 +23,7 @@
         </w:trPr>
         <w:tc>
           <w:tcPr>
+            <w:tcW w:w="0" w:type="auto"/>
             <w:noWrap/>
             <w:tcMar>
               <w:left w:w="58" w:type="dxa"/>
@@ -185,8 +185,8 @@
             </w:tblPr>
             <w:tblGrid>
               <w:gridCol w:w="1074"/>
-              <w:gridCol w:w="621"/>
-              <w:gridCol w:w="753"/>
+              <w:gridCol w:w="613"/>
+              <w:gridCol w:w="761"/>
             </w:tblGrid>
             <w:tr>
               <w:trPr>
@@ -301,8 +301,8 @@
                 <w:rFonts w:ascii="Arial" w:hAnsi="Arial" w:cs="Arial"/>
                 <w:b/>
                 <w:bCs/>
-                <w:sz w:val="11"/>
-                <w:szCs w:val="11"/>
+                <w:sz w:val="8"/>
+                <w:szCs w:val="8"/>
               </w:rPr>
             </w:pPr>
             <w:r>
@@ -310,8 +310,8 @@
                 <w:rFonts w:ascii="Arial" w:hAnsi="Arial" w:cs="Arial"/>
                 <w:b/>
                 <w:bCs/>
-                <w:sz w:val="11"/>
-                <w:szCs w:val="11"/>
+                <w:sz w:val="8"/>
+                <w:szCs w:val="8"/>
               </w:rPr>
               <w:t>{{Label1.Lineage}}</w:t>
             </w:r>
@@ -322,8 +322,8 @@
                 <w:rFonts w:ascii="Arial" w:hAnsi="Arial" w:cs="Arial"/>
                 <w:b/>
                 <w:bCs/>
-                <w:sz w:val="11"/>
-                <w:szCs w:val="11"/>
+                <w:sz w:val="8"/>
+                <w:szCs w:val="8"/>
               </w:rPr>
             </w:pPr>
             <w:r>
@@ -333,6 +333,16 @@
                 <w:bCs/>
                 <w:sz w:val="8"/>
                 <w:szCs w:val="8"/>
+              </w:rPr>
+              <w:t xml:space="preserve"> </w:t>
+            </w:r>
+            <w:r>
+              <w:rPr>
+                <w:rFonts w:ascii="Arial" w:hAnsi="Arial" w:cs="Arial"/>
+                <w:b/>
+                <w:bCs/>
+                <w:sz w:val="4"/>
+                <w:szCs w:val="4"/>
               </w:rPr>
               <w:t>{{Label1.ProductStrain}}</w:t>
             </w:r>

</xml_diff>

<commit_message>
Increase file path text size by 2pt: update inline style from 11px to 13px and CSS classes
</commit_message>
<xml_diff>
--- a/src/core/generation/templates/Double.docx
+++ b/src/core/generation/templates/Double.docx
@@ -57,7 +57,7 @@
             <w:tr>
               <w:trPr>
                 <w:cantSplit/>
-                <w:trHeight w:val="2016"/>
+                <w:trHeight w:val="1944"/>
                 <w:jc w:val="center"/>
               </w:trPr>
               <w:tc>
@@ -98,18 +98,6 @@
                     </w:rPr>
                     <w:t>{{Label1.DescAndWeight}}</w:t>
                   </w:r>
-                </w:p>
-                <w:p>
-                  <w:pPr>
-                    <w:spacing w:line="216" w:lineRule="auto"/>
-                    <w:rPr>
-                      <w:rFonts w:ascii="Arial" w:hAnsi="Arial" w:cs="Arial"/>
-                      <w:b/>
-                      <w:bCs/>
-                      <w:sz w:val="11"/>
-                      <w:szCs w:val="11"/>
-                    </w:rPr>
-                  </w:pPr>
                 </w:p>
               </w:tc>
             </w:tr>
@@ -305,6 +293,16 @@
                 <w:szCs w:val="8"/>
               </w:rPr>
             </w:pPr>
+            <w:r>
+              <w:rPr>
+                <w:rFonts w:ascii="Arial" w:hAnsi="Arial" w:cs="Arial"/>
+                <w:b/>
+                <w:bCs/>
+                <w:sz w:val="8"/>
+                <w:szCs w:val="8"/>
+              </w:rPr>
+              <w:br/>
+            </w:r>
             <w:r>
               <w:rPr>
                 <w:rFonts w:ascii="Arial" w:hAnsi="Arial" w:cs="Arial"/>

</xml_diff>

<commit_message>
Code cleanup and performance improvements
App.py changes:
- Re-enable clear_all_on_startup for fresh store selection on restart
- Simplify get_current_store_name fallback logic
- Enable Excel processor initialization on local development
- Re-enable check-store-required endpoint caching

Core changes:
- Optimize JSON matcher (reduce complexity)
- Streamline template processor
- Clean up unified font sizing
- Update Excel processor

UI changes:
- CSS cleanup and optimization
- JavaScript code reduction and optimization
- Template cleanup

Other:
- Remove temporary diagnostic files
- Remove test scripts
- Update Word template files

Overall ~2000 lines of code removed through optimization and cleanup.

🤖 Generated with [Claude Code](https://claude.com/claude-code)

Co-Authored-By: Claude Sonnet 4.5 <noreply@anthropic.com>
</commit_message>
<xml_diff>
--- a/src/core/generation/templates/Double.docx
+++ b/src/core/generation/templates/Double.docx
@@ -6,6 +6,7 @@
       <w:tblPr>
         <w:tblW w:w="0" w:type="auto"/>
         <w:jc w:val="center"/>
+        <w:tblLayout w:type="autofit"/>
         <w:tblCellMar>
           <w:left w:w="15" w:type="dxa"/>
           <w:right w:w="15" w:type="dxa"/>
@@ -13,7 +14,7 @@
         <w:tblLook w:val="0000" w:firstRow="0" w:lastRow="0" w:firstColumn="0" w:lastColumn="0" w:noHBand="0" w:noVBand="0"/>
       </w:tblPr>
       <w:tblGrid>
-        <w:gridCol w:w="2564"/>
+        <w:gridCol/>
       </w:tblGrid>
       <w:tr>
         <w:trPr>
@@ -23,7 +24,6 @@
         </w:trPr>
         <w:tc>
           <w:tcPr>
-            <w:tcW w:w="0" w:type="auto"/>
             <w:noWrap/>
             <w:tcMar>
               <w:left w:w="58" w:type="dxa"/>
@@ -57,7 +57,7 @@
             <w:tr>
               <w:trPr>
                 <w:cantSplit/>
-                <w:trHeight w:val="1944"/>
+                <w:trHeight w:val="2016"/>
                 <w:jc w:val="center"/>
               </w:trPr>
               <w:tc>
@@ -98,6 +98,18 @@
                     </w:rPr>
                     <w:t>{{Label1.DescAndWeight}}</w:t>
                   </w:r>
+                </w:p>
+                <w:p>
+                  <w:pPr>
+                    <w:spacing w:line="216" w:lineRule="auto"/>
+                    <w:rPr>
+                      <w:rFonts w:ascii="Arial" w:hAnsi="Arial" w:cs="Arial"/>
+                      <w:b/>
+                      <w:bCs/>
+                      <w:sz w:val="11"/>
+                      <w:szCs w:val="11"/>
+                    </w:rPr>
+                  </w:pPr>
                 </w:p>
               </w:tc>
             </w:tr>
@@ -173,8 +185,8 @@
             </w:tblPr>
             <w:tblGrid>
               <w:gridCol w:w="1074"/>
-              <w:gridCol w:w="613"/>
-              <w:gridCol w:w="761"/>
+              <w:gridCol w:w="621"/>
+              <w:gridCol w:w="753"/>
             </w:tblGrid>
             <w:tr>
               <w:trPr>
@@ -289,8 +301,8 @@
                 <w:rFonts w:ascii="Arial" w:hAnsi="Arial" w:cs="Arial"/>
                 <w:b/>
                 <w:bCs/>
-                <w:sz w:val="8"/>
-                <w:szCs w:val="8"/>
+                <w:sz w:val="11"/>
+                <w:szCs w:val="11"/>
               </w:rPr>
             </w:pPr>
             <w:r>
@@ -298,18 +310,8 @@
                 <w:rFonts w:ascii="Arial" w:hAnsi="Arial" w:cs="Arial"/>
                 <w:b/>
                 <w:bCs/>
-                <w:sz w:val="8"/>
-                <w:szCs w:val="8"/>
-              </w:rPr>
-              <w:br/>
-            </w:r>
-            <w:r>
-              <w:rPr>
-                <w:rFonts w:ascii="Arial" w:hAnsi="Arial" w:cs="Arial"/>
-                <w:b/>
-                <w:bCs/>
-                <w:sz w:val="8"/>
-                <w:szCs w:val="8"/>
+                <w:sz w:val="11"/>
+                <w:szCs w:val="11"/>
               </w:rPr>
               <w:t>{{Label1.Lineage}}</w:t>
             </w:r>
@@ -320,8 +322,8 @@
                 <w:rFonts w:ascii="Arial" w:hAnsi="Arial" w:cs="Arial"/>
                 <w:b/>
                 <w:bCs/>
-                <w:sz w:val="8"/>
-                <w:szCs w:val="8"/>
+                <w:sz w:val="11"/>
+                <w:szCs w:val="11"/>
               </w:rPr>
             </w:pPr>
             <w:r>
@@ -331,16 +333,6 @@
                 <w:bCs/>
                 <w:sz w:val="8"/>
                 <w:szCs w:val="8"/>
-              </w:rPr>
-              <w:t xml:space="preserve"> </w:t>
-            </w:r>
-            <w:r>
-              <w:rPr>
-                <w:rFonts w:ascii="Arial" w:hAnsi="Arial" w:cs="Arial"/>
-                <w:b/>
-                <w:bCs/>
-                <w:sz w:val="4"/>
-                <w:szCs w:val="4"/>
               </w:rPr>
               <w:t>{{Label1.ProductStrain}}</w:t>
             </w:r>

</xml_diff>

<commit_message>
Fix double template lineage/brand display and update formatting logic
</commit_message>
<xml_diff>
--- a/src/core/generation/templates/Double.docx
+++ b/src/core/generation/templates/Double.docx
@@ -6,7 +6,7 @@
       <w:tblPr>
         <w:tblW w:w="0" w:type="auto"/>
         <w:jc w:val="center"/>
-        <w:tblLayout w:type="autofit"/>
+        <w:tblLayout w:type="fixed"/>
         <w:tblCellMar>
           <w:left w:w="15" w:type="dxa"/>
           <w:right w:w="15" w:type="dxa"/>
@@ -14,7 +14,7 @@
         <w:tblLook w:val="0000" w:firstRow="0" w:lastRow="0" w:firstColumn="0" w:lastColumn="0" w:noHBand="0" w:noVBand="0"/>
       </w:tblPr>
       <w:tblGrid>
-        <w:gridCol/>
+        <w:gridCol w:w="2520"/>
       </w:tblGrid>
       <w:tr>
         <w:trPr>
@@ -24,6 +24,7 @@
         </w:trPr>
         <w:tc>
           <w:tcPr>
+            <w:tcW w:w="2520" w:type="dxa"/>
             <w:noWrap/>
             <w:tcMar>
               <w:left w:w="58" w:type="dxa"/>
@@ -57,7 +58,7 @@
             <w:tr>
               <w:trPr>
                 <w:cantSplit/>
-                <w:trHeight w:val="2016"/>
+                <w:trHeight w:hRule="exact" w:val="2312"/>
                 <w:jc w:val="center"/>
               </w:trPr>
               <w:tc>
@@ -110,54 +111,6 @@
                       <w:szCs w:val="11"/>
                     </w:rPr>
                   </w:pPr>
-                </w:p>
-              </w:tc>
-            </w:tr>
-            <w:tr>
-              <w:trPr>
-                <w:cantSplit/>
-                <w:trHeight w:hRule="exact" w:val="216"/>
-                <w:jc w:val="center"/>
-              </w:trPr>
-              <w:tc>
-                <w:tcPr>
-                  <w:tcW w:w="2448" w:type="dxa"/>
-                  <w:tcBorders>
-                    <w:top w:val="nil"/>
-                    <w:left w:val="nil"/>
-                    <w:bottom w:val="nil"/>
-                    <w:right w:val="nil"/>
-                  </w:tcBorders>
-                  <w:shd w:val="clear" w:color="auto" w:fill="FFFFFF" w:themeFill="background1"/>
-                  <w:tcMar>
-                    <w:top w:w="58" w:type="dxa"/>
-                    <w:left w:w="58" w:type="dxa"/>
-                    <w:bottom w:w="58" w:type="dxa"/>
-                    <w:right w:w="58" w:type="dxa"/>
-                  </w:tcMar>
-                </w:tcPr>
-                <w:p>
-                  <w:pPr>
-                    <w:spacing w:line="216" w:lineRule="auto"/>
-                    <w:jc w:val="right"/>
-                    <w:rPr>
-                      <w:rFonts w:ascii="Arial" w:hAnsi="Arial" w:cs="Arial"/>
-                      <w:b/>
-                      <w:bCs/>
-                      <w:sz w:val="10"/>
-                      <w:szCs w:val="10"/>
-                    </w:rPr>
-                  </w:pPr>
-                  <w:r>
-                    <w:rPr>
-                      <w:rFonts w:ascii="Arial" w:hAnsi="Arial" w:cs="Arial"/>
-                      <w:b/>
-                      <w:bCs/>
-                      <w:sz w:val="10"/>
-                      <w:szCs w:val="10"/>
-                    </w:rPr>
-                    <w:t>{{Label1.ProductVendor}}</w:t>
-                  </w:r>
                 </w:p>
               </w:tc>
             </w:tr>

</xml_diff>

<commit_message>
EXCEL-ONLY MODE: Disable all database tag loading - only use Excel tags
</commit_message>
<xml_diff>
--- a/src/core/generation/templates/Double.docx
+++ b/src/core/generation/templates/Double.docx
@@ -6,7 +6,7 @@
       <w:tblPr>
         <w:tblW w:w="0" w:type="auto"/>
         <w:jc w:val="center"/>
-        <w:tblLayout w:type="fixed"/>
+        <w:tblLayout w:type="autofit"/>
         <w:tblCellMar>
           <w:left w:w="15" w:type="dxa"/>
           <w:right w:w="15" w:type="dxa"/>
@@ -14,7 +14,7 @@
         <w:tblLook w:val="0000" w:firstRow="0" w:lastRow="0" w:firstColumn="0" w:lastColumn="0" w:noHBand="0" w:noVBand="0"/>
       </w:tblPr>
       <w:tblGrid>
-        <w:gridCol w:w="2520"/>
+        <w:gridCol/>
       </w:tblGrid>
       <w:tr>
         <w:trPr>
@@ -24,7 +24,6 @@
         </w:trPr>
         <w:tc>
           <w:tcPr>
-            <w:tcW w:w="2520" w:type="dxa"/>
             <w:noWrap/>
             <w:tcMar>
               <w:left w:w="58" w:type="dxa"/>
@@ -58,7 +57,7 @@
             <w:tr>
               <w:trPr>
                 <w:cantSplit/>
-                <w:trHeight w:hRule="exact" w:val="2312"/>
+                <w:trHeight w:val="2016"/>
                 <w:jc w:val="center"/>
               </w:trPr>
               <w:tc>
@@ -111,6 +110,54 @@
                       <w:szCs w:val="11"/>
                     </w:rPr>
                   </w:pPr>
+                </w:p>
+              </w:tc>
+            </w:tr>
+            <w:tr>
+              <w:trPr>
+                <w:cantSplit/>
+                <w:trHeight w:hRule="exact" w:val="216"/>
+                <w:jc w:val="center"/>
+              </w:trPr>
+              <w:tc>
+                <w:tcPr>
+                  <w:tcW w:w="2448" w:type="dxa"/>
+                  <w:tcBorders>
+                    <w:top w:val="nil"/>
+                    <w:left w:val="nil"/>
+                    <w:bottom w:val="nil"/>
+                    <w:right w:val="nil"/>
+                  </w:tcBorders>
+                  <w:shd w:val="clear" w:color="auto" w:fill="FFFFFF" w:themeFill="background1"/>
+                  <w:tcMar>
+                    <w:top w:w="58" w:type="dxa"/>
+                    <w:left w:w="58" w:type="dxa"/>
+                    <w:bottom w:w="58" w:type="dxa"/>
+                    <w:right w:w="58" w:type="dxa"/>
+                  </w:tcMar>
+                </w:tcPr>
+                <w:p>
+                  <w:pPr>
+                    <w:spacing w:line="216" w:lineRule="auto"/>
+                    <w:jc w:val="right"/>
+                    <w:rPr>
+                      <w:rFonts w:ascii="Arial" w:hAnsi="Arial" w:cs="Arial"/>
+                      <w:b/>
+                      <w:bCs/>
+                      <w:sz w:val="10"/>
+                      <w:szCs w:val="10"/>
+                    </w:rPr>
+                  </w:pPr>
+                  <w:r>
+                    <w:rPr>
+                      <w:rFonts w:ascii="Arial" w:hAnsi="Arial" w:cs="Arial"/>
+                      <w:b/>
+                      <w:bCs/>
+                      <w:sz w:val="10"/>
+                      <w:szCs w:val="10"/>
+                    </w:rPr>
+                    <w:t>{{Label1.ProductVendor}}</w:t>
+                  </w:r>
                 </w:p>
               </w:tc>
             </w:tr>

</xml_diff>

<commit_message>
Fix lineage font sizing - preserve existing sizes instead of recalculating
</commit_message>
<xml_diff>
--- a/src/core/generation/templates/Double.docx
+++ b/src/core/generation/templates/Double.docx
@@ -6,7 +6,6 @@
       <w:tblPr>
         <w:tblW w:w="0" w:type="auto"/>
         <w:jc w:val="center"/>
-        <w:tblLayout w:type="autofit"/>
         <w:tblCellMar>
           <w:left w:w="15" w:type="dxa"/>
           <w:right w:w="15" w:type="dxa"/>
@@ -14,7 +13,7 @@
         <w:tblLook w:val="0000" w:firstRow="0" w:lastRow="0" w:firstColumn="0" w:lastColumn="0" w:noHBand="0" w:noVBand="0"/>
       </w:tblPr>
       <w:tblGrid>
-        <w:gridCol/>
+        <w:gridCol w:w="2564"/>
       </w:tblGrid>
       <w:tr>
         <w:trPr>
@@ -24,6 +23,7 @@
         </w:trPr>
         <w:tc>
           <w:tcPr>
+            <w:tcW w:w="0" w:type="auto"/>
             <w:noWrap/>
             <w:tcMar>
               <w:left w:w="58" w:type="dxa"/>
@@ -57,7 +57,7 @@
             <w:tr>
               <w:trPr>
                 <w:cantSplit/>
-                <w:trHeight w:val="2016"/>
+                <w:trHeight w:hRule="exact" w:val="2016"/>
                 <w:jc w:val="center"/>
               </w:trPr>
               <w:tc>
@@ -185,13 +185,13 @@
             </w:tblPr>
             <w:tblGrid>
               <w:gridCol w:w="1074"/>
-              <w:gridCol w:w="621"/>
-              <w:gridCol w:w="753"/>
+              <w:gridCol w:w="613"/>
+              <w:gridCol w:w="761"/>
             </w:tblGrid>
             <w:tr>
               <w:trPr>
                 <w:cantSplit/>
-                <w:trHeight w:val="749"/>
+                <w:trHeight w:hRule="exact" w:val="749"/>
               </w:trPr>
               <w:tc>
                 <w:tcPr>

</xml_diff>

<commit_message>
Cleanup: reorganize project structure and remove temporary files
</commit_message>
<xml_diff>
--- a/src/core/generation/templates/Double.docx
+++ b/src/core/generation/templates/Double.docx
@@ -6,6 +6,7 @@
       <w:tblPr>
         <w:tblW w:w="0" w:type="auto"/>
         <w:jc w:val="center"/>
+        <w:tblLayout w:type="autofit"/>
         <w:tblCellMar>
           <w:left w:w="15" w:type="dxa"/>
           <w:right w:w="15" w:type="dxa"/>
@@ -13,7 +14,7 @@
         <w:tblLook w:val="0000" w:firstRow="0" w:lastRow="0" w:firstColumn="0" w:lastColumn="0" w:noHBand="0" w:noVBand="0"/>
       </w:tblPr>
       <w:tblGrid>
-        <w:gridCol w:w="2564"/>
+        <w:gridCol/>
       </w:tblGrid>
       <w:tr>
         <w:trPr>
@@ -23,7 +24,6 @@
         </w:trPr>
         <w:tc>
           <w:tcPr>
-            <w:tcW w:w="0" w:type="auto"/>
             <w:noWrap/>
             <w:tcMar>
               <w:left w:w="58" w:type="dxa"/>
@@ -57,7 +57,7 @@
             <w:tr>
               <w:trPr>
                 <w:cantSplit/>
-                <w:trHeight w:hRule="exact" w:val="2016"/>
+                <w:trHeight w:val="2016"/>
                 <w:jc w:val="center"/>
               </w:trPr>
               <w:tc>
@@ -185,13 +185,13 @@
             </w:tblPr>
             <w:tblGrid>
               <w:gridCol w:w="1074"/>
-              <w:gridCol w:w="613"/>
-              <w:gridCol w:w="761"/>
+              <w:gridCol w:w="621"/>
+              <w:gridCol w:w="753"/>
             </w:tblGrid>
             <w:tr>
               <w:trPr>
                 <w:cantSplit/>
-                <w:trHeight w:hRule="exact" w:val="749"/>
+                <w:trHeight w:val="749"/>
               </w:trPr>
               <w:tc>
                 <w:tcPr>

</xml_diff>

<commit_message>
Clean up test files and update application
</commit_message>
<xml_diff>
--- a/src/core/generation/templates/Double.docx
+++ b/src/core/generation/templates/Double.docx
@@ -267,46 +267,6 @@
                 <w:szCs w:val="11"/>
               </w:rPr>
               <w:t>{{Label1.Lineage}}</w:t>
-            </w:r>
-            <w:r>
-              <w:rPr>
-                <w:rFonts w:ascii="Arial" w:hAnsi="Arial" w:cs="Arial"/>
-                <w:b/>
-                <w:bCs/>
-                <w:sz w:val="11"/>
-                <w:szCs w:val="11"/>
-              </w:rPr>
-              <w:t xml:space="preserve"> </w:t>
-            </w:r>
-            <w:r>
-              <w:rPr>
-                <w:rFonts w:ascii="Arial" w:hAnsi="Arial" w:cs="Arial"/>
-                <w:b/>
-                <w:bCs/>
-                <w:sz w:val="11"/>
-                <w:szCs w:val="11"/>
-              </w:rPr>
-              <w:t>{{Label1.Product</w:t>
-            </w:r>
-            <w:r>
-              <w:rPr>
-                <w:rFonts w:ascii="Arial" w:hAnsi="Arial" w:cs="Arial"/>
-                <w:b/>
-                <w:bCs/>
-                <w:sz w:val="11"/>
-                <w:szCs w:val="11"/>
-              </w:rPr>
-              <w:t>Vendor</w:t>
-            </w:r>
-            <w:r>
-              <w:rPr>
-                <w:rFonts w:ascii="Arial" w:hAnsi="Arial" w:cs="Arial"/>
-                <w:b/>
-                <w:bCs/>
-                <w:sz w:val="11"/>
-                <w:szCs w:val="11"/>
-              </w:rPr>
-              <w:t>}}</w:t>
             </w:r>
           </w:p>
           <w:p>
@@ -977,6 +937,7 @@
   <w:style w:type="character" w:default="1" w:styleId="DefaultParagraphFont">
     <w:name w:val="Default Paragraph Font"/>
     <w:uiPriority w:val="1"/>
+    <w:semiHidden/>
     <w:unhideWhenUsed/>
   </w:style>
   <w:style w:type="table" w:default="1" w:styleId="TableNormal">

</xml_diff>

<commit_message>
Update templates and core application files
</commit_message>
<xml_diff>
--- a/src/core/generation/templates/Double.docx
+++ b/src/core/generation/templates/Double.docx
@@ -6,7 +6,6 @@
       <w:tblPr>
         <w:tblW w:w="0" w:type="auto"/>
         <w:jc w:val="center"/>
-        <w:tblLayout w:type="fixed"/>
         <w:tblCellMar>
           <w:left w:w="15" w:type="dxa"/>
           <w:right w:w="15" w:type="dxa"/>
@@ -14,7 +13,7 @@
         <w:tblLook w:val="0000" w:firstRow="0" w:lastRow="0" w:firstColumn="0" w:lastColumn="0" w:noHBand="0" w:noVBand="0"/>
       </w:tblPr>
       <w:tblGrid>
-        <w:gridCol w:w="2520"/>
+        <w:gridCol w:w="2564"/>
       </w:tblGrid>
       <w:tr>
         <w:trPr>
@@ -24,7 +23,7 @@
         </w:trPr>
         <w:tc>
           <w:tcPr>
-            <w:tcW w:w="2520" w:type="dxa"/>
+            <w:tcW w:w="0" w:type="auto"/>
             <w:noWrap/>
             <w:tcMar>
               <w:left w:w="58" w:type="dxa"/>
@@ -58,7 +57,7 @@
             <w:tr>
               <w:trPr>
                 <w:cantSplit/>
-                <w:trHeight w:hRule="exact" w:val="2312"/>
+                <w:trHeight w:val="1944"/>
                 <w:jc w:val="center"/>
               </w:trPr>
               <w:tc>
@@ -100,17 +99,53 @@
                     <w:t>{{Label1.DescAndWeight}}</w:t>
                   </w:r>
                 </w:p>
+              </w:tc>
+            </w:tr>
+            <w:tr>
+              <w:trPr>
+                <w:cantSplit/>
+                <w:trHeight w:hRule="exact" w:val="216"/>
+                <w:jc w:val="center"/>
+              </w:trPr>
+              <w:tc>
+                <w:tcPr>
+                  <w:tcW w:w="2448" w:type="dxa"/>
+                  <w:tcBorders>
+                    <w:top w:val="nil"/>
+                    <w:left w:val="nil"/>
+                    <w:bottom w:val="nil"/>
+                    <w:right w:val="nil"/>
+                  </w:tcBorders>
+                  <w:shd w:val="clear" w:color="auto" w:fill="FFFFFF" w:themeFill="background1"/>
+                  <w:tcMar>
+                    <w:top w:w="58" w:type="dxa"/>
+                    <w:left w:w="58" w:type="dxa"/>
+                    <w:bottom w:w="58" w:type="dxa"/>
+                    <w:right w:w="58" w:type="dxa"/>
+                  </w:tcMar>
+                </w:tcPr>
                 <w:p>
                   <w:pPr>
                     <w:spacing w:line="216" w:lineRule="auto"/>
+                    <w:jc w:val="right"/>
                     <w:rPr>
                       <w:rFonts w:ascii="Arial" w:hAnsi="Arial" w:cs="Arial"/>
                       <w:b/>
                       <w:bCs/>
-                      <w:sz w:val="11"/>
-                      <w:szCs w:val="11"/>
+                      <w:sz w:val="10"/>
+                      <w:szCs w:val="10"/>
                     </w:rPr>
                   </w:pPr>
+                  <w:r>
+                    <w:rPr>
+                      <w:rFonts w:ascii="Arial" w:hAnsi="Arial" w:cs="Arial"/>
+                      <w:b/>
+                      <w:bCs/>
+                      <w:sz w:val="10"/>
+                      <w:szCs w:val="10"/>
+                    </w:rPr>
+                    <w:t>{{Label1.ProductVendor}}</w:t>
+                  </w:r>
                 </w:p>
               </w:tc>
             </w:tr>
@@ -138,8 +173,8 @@
             </w:tblPr>
             <w:tblGrid>
               <w:gridCol w:w="1074"/>
-              <w:gridCol w:w="621"/>
-              <w:gridCol w:w="753"/>
+              <w:gridCol w:w="613"/>
+              <w:gridCol w:w="761"/>
             </w:tblGrid>
             <w:tr>
               <w:trPr>
@@ -254,8 +289,8 @@
                 <w:rFonts w:ascii="Arial" w:hAnsi="Arial" w:cs="Arial"/>
                 <w:b/>
                 <w:bCs/>
-                <w:sz w:val="11"/>
-                <w:szCs w:val="11"/>
+                <w:sz w:val="8"/>
+                <w:szCs w:val="8"/>
               </w:rPr>
             </w:pPr>
             <w:r>
@@ -263,8 +298,18 @@
                 <w:rFonts w:ascii="Arial" w:hAnsi="Arial" w:cs="Arial"/>
                 <w:b/>
                 <w:bCs/>
-                <w:sz w:val="11"/>
-                <w:szCs w:val="11"/>
+                <w:sz w:val="8"/>
+                <w:szCs w:val="8"/>
+              </w:rPr>
+              <w:br/>
+            </w:r>
+            <w:r>
+              <w:rPr>
+                <w:rFonts w:ascii="Arial" w:hAnsi="Arial" w:cs="Arial"/>
+                <w:b/>
+                <w:bCs/>
+                <w:sz w:val="8"/>
+                <w:szCs w:val="8"/>
               </w:rPr>
               <w:t>{{Label1.Lineage}}</w:t>
             </w:r>
@@ -275,8 +320,8 @@
                 <w:rFonts w:ascii="Arial" w:hAnsi="Arial" w:cs="Arial"/>
                 <w:b/>
                 <w:bCs/>
-                <w:sz w:val="11"/>
-                <w:szCs w:val="11"/>
+                <w:sz w:val="8"/>
+                <w:szCs w:val="8"/>
               </w:rPr>
             </w:pPr>
             <w:r>
@@ -286,6 +331,16 @@
                 <w:bCs/>
                 <w:sz w:val="8"/>
                 <w:szCs w:val="8"/>
+              </w:rPr>
+              <w:t xml:space="preserve"> </w:t>
+            </w:r>
+            <w:r>
+              <w:rPr>
+                <w:rFonts w:ascii="Arial" w:hAnsi="Arial" w:cs="Arial"/>
+                <w:b/>
+                <w:bCs/>
+                <w:sz w:val="4"/>
+                <w:szCs w:val="4"/>
               </w:rPr>
               <w:t>{{Label1.ProductStrain}}</w:t>
             </w:r>

</xml_diff>

<commit_message>
Persist inferred lineage from JSON/inference in EnhancedJSONMatcher
</commit_message>
<xml_diff>
--- a/src/core/generation/templates/Double.docx
+++ b/src/core/generation/templates/Double.docx
@@ -37,14 +37,6 @@
               <w:tblOverlap w:val="never"/>
               <w:tblW w:w="2448" w:type="dxa"/>
               <w:jc w:val="center"/>
-              <w:tblBorders>
-                <w:top w:val="single" w:sz="4" w:space="0" w:color="FFFFFF" w:themeColor="background1"/>
-                <w:left w:val="single" w:sz="4" w:space="0" w:color="FFFFFF" w:themeColor="background1"/>
-                <w:bottom w:val="single" w:sz="4" w:space="0" w:color="FFFFFF" w:themeColor="background1"/>
-                <w:right w:val="single" w:sz="4" w:space="0" w:color="FFFFFF" w:themeColor="background1"/>
-                <w:insideH w:val="single" w:sz="4" w:space="0" w:color="FFFFFF" w:themeColor="background1"/>
-                <w:insideV w:val="single" w:sz="4" w:space="0" w:color="FFFFFF" w:themeColor="background1"/>
-              </w:tblBorders>
               <w:tblLayout w:type="fixed"/>
               <w:tblCellMar>
                 <w:top w:w="43" w:type="dxa"/>
@@ -63,12 +55,6 @@
               <w:tc>
                 <w:tcPr>
                   <w:tcW w:w="2448" w:type="dxa"/>
-                  <w:tcBorders>
-                    <w:top w:val="nil"/>
-                    <w:left w:val="nil"/>
-                    <w:bottom w:val="nil"/>
-                    <w:right w:val="nil"/>
-                  </w:tcBorders>
                   <w:shd w:val="clear" w:color="auto" w:fill="FFFFFF" w:themeFill="background1"/>
                   <w:tcMar>
                     <w:top w:w="58" w:type="dxa"/>
@@ -104,19 +90,12 @@
             <w:tr>
               <w:trPr>
                 <w:cantSplit/>
-                <w:trHeight w:hRule="exact" w:val="216"/>
+                <w:trHeight w:hRule="exact" w:val="144"/>
                 <w:jc w:val="center"/>
               </w:trPr>
               <w:tc>
                 <w:tcPr>
                   <w:tcW w:w="2448" w:type="dxa"/>
-                  <w:tcBorders>
-                    <w:top w:val="nil"/>
-                    <w:left w:val="nil"/>
-                    <w:bottom w:val="nil"/>
-                    <w:right w:val="nil"/>
-                  </w:tcBorders>
-                  <w:shd w:val="clear" w:color="auto" w:fill="FFFFFF" w:themeFill="background1"/>
                   <w:tcMar>
                     <w:top w:w="58" w:type="dxa"/>
                     <w:left w:w="58" w:type="dxa"/>
@@ -132,8 +111,8 @@
                       <w:rFonts w:ascii="Arial" w:hAnsi="Arial" w:cs="Arial"/>
                       <w:b/>
                       <w:bCs/>
-                      <w:sz w:val="10"/>
-                      <w:szCs w:val="10"/>
+                      <w:sz w:val="8"/>
+                      <w:szCs w:val="8"/>
                     </w:rPr>
                   </w:pPr>
                   <w:r>
@@ -141,8 +120,8 @@
                       <w:rFonts w:ascii="Arial" w:hAnsi="Arial" w:cs="Arial"/>
                       <w:b/>
                       <w:bCs/>
-                      <w:sz w:val="10"/>
-                      <w:szCs w:val="10"/>
+                      <w:sz w:val="8"/>
+                      <w:szCs w:val="8"/>
                     </w:rPr>
                     <w:t>{{Label1.ProductVendor}}</w:t>
                   </w:r>

</xml_diff>

<commit_message>
chore: add and push (user requested)
</commit_message>
<xml_diff>
--- a/src/core/generation/templates/Double.docx
+++ b/src/core/generation/templates/Double.docx
@@ -37,7 +37,6 @@
               <w:tblOverlap w:val="never"/>
               <w:tblW w:w="2448" w:type="dxa"/>
               <w:jc w:val="center"/>
-              <w:shd w:val="clear" w:color="auto" w:fill="FFFFFF" w:themeFill="background1"/>
               <w:tblLayout w:type="fixed"/>
               <w:tblCellMar>
                 <w:top w:w="43" w:type="dxa"/>
@@ -50,7 +49,7 @@
             <w:tr>
               <w:trPr>
                 <w:cantSplit/>
-                <w:trHeight w:val="2016"/>
+                <w:trHeight w:val="1944"/>
                 <w:jc w:val="center"/>
               </w:trPr>
               <w:tc>
@@ -97,11 +96,10 @@
               <w:tc>
                 <w:tcPr>
                   <w:tcW w:w="2448" w:type="dxa"/>
-                  <w:shd w:val="clear" w:color="auto" w:fill="FFFFFF" w:themeFill="background1"/>
                   <w:tcMar>
-                    <w:top w:w="0" w:type="dxa"/>
+                    <w:top w:w="58" w:type="dxa"/>
                     <w:left w:w="58" w:type="dxa"/>
-                    <w:bottom w:w="0" w:type="dxa"/>
+                    <w:bottom w:w="58" w:type="dxa"/>
                     <w:right w:w="58" w:type="dxa"/>
                   </w:tcMar>
                 </w:tcPr>

</xml_diff>

<commit_message>
Update templates and unified font sizing
Co-authored-by: Cursor <cursoragent@cursor.com>
</commit_message>
<xml_diff>
--- a/src/core/generation/templates/Double.docx
+++ b/src/core/generation/templates/Double.docx
@@ -6,6 +6,7 @@
       <w:tblPr>
         <w:tblW w:w="0" w:type="auto"/>
         <w:jc w:val="center"/>
+        <w:tblLayout w:type="fixed"/>
         <w:tblCellMar>
           <w:left w:w="15" w:type="dxa"/>
           <w:right w:w="15" w:type="dxa"/>
@@ -13,7 +14,7 @@
         <w:tblLook w:val="0000" w:firstRow="0" w:lastRow="0" w:firstColumn="0" w:lastColumn="0" w:noHBand="0" w:noVBand="0"/>
       </w:tblPr>
       <w:tblGrid>
-        <w:gridCol w:w="2564"/>
+        <w:gridCol w:w="2520"/>
       </w:tblGrid>
       <w:tr>
         <w:trPr>
@@ -23,7 +24,7 @@
         </w:trPr>
         <w:tc>
           <w:tcPr>
-            <w:tcW w:w="0" w:type="auto"/>
+            <w:tcW w:w="2520" w:type="dxa"/>
             <w:noWrap/>
             <w:tcMar>
               <w:left w:w="58" w:type="dxa"/>
@@ -57,7 +58,7 @@
             <w:tr>
               <w:trPr>
                 <w:cantSplit/>
-                <w:trHeight w:val="1944"/>
+                <w:trHeight w:hRule="exact" w:val="2312"/>
                 <w:jc w:val="center"/>
               </w:trPr>
               <w:tc>
@@ -99,53 +100,17 @@
                     <w:t>{{Label1.DescAndWeight}}</w:t>
                   </w:r>
                 </w:p>
-              </w:tc>
-            </w:tr>
-            <w:tr>
-              <w:trPr>
-                <w:cantSplit/>
-                <w:trHeight w:hRule="exact" w:val="216"/>
-                <w:jc w:val="center"/>
-              </w:trPr>
-              <w:tc>
-                <w:tcPr>
-                  <w:tcW w:w="2448" w:type="dxa"/>
-                  <w:tcBorders>
-                    <w:top w:val="nil"/>
-                    <w:left w:val="nil"/>
-                    <w:bottom w:val="nil"/>
-                    <w:right w:val="nil"/>
-                  </w:tcBorders>
-                  <w:shd w:val="clear" w:color="auto" w:fill="FFFFFF" w:themeFill="background1"/>
-                  <w:tcMar>
-                    <w:top w:w="58" w:type="dxa"/>
-                    <w:left w:w="58" w:type="dxa"/>
-                    <w:bottom w:w="58" w:type="dxa"/>
-                    <w:right w:w="58" w:type="dxa"/>
-                  </w:tcMar>
-                </w:tcPr>
                 <w:p>
                   <w:pPr>
                     <w:spacing w:line="216" w:lineRule="auto"/>
-                    <w:jc w:val="right"/>
                     <w:rPr>
                       <w:rFonts w:ascii="Arial" w:hAnsi="Arial" w:cs="Arial"/>
                       <w:b/>
                       <w:bCs/>
-                      <w:sz w:val="10"/>
-                      <w:szCs w:val="10"/>
+                      <w:sz w:val="11"/>
+                      <w:szCs w:val="11"/>
                     </w:rPr>
                   </w:pPr>
-                  <w:r>
-                    <w:rPr>
-                      <w:rFonts w:ascii="Arial" w:hAnsi="Arial" w:cs="Arial"/>
-                      <w:b/>
-                      <w:bCs/>
-                      <w:sz w:val="10"/>
-                      <w:szCs w:val="10"/>
-                    </w:rPr>
-                    <w:t>{{Label1.ProductVendor}}</w:t>
-                  </w:r>
                 </w:p>
               </w:tc>
             </w:tr>
@@ -173,8 +138,8 @@
             </w:tblPr>
             <w:tblGrid>
               <w:gridCol w:w="1074"/>
-              <w:gridCol w:w="613"/>
-              <w:gridCol w:w="761"/>
+              <w:gridCol w:w="621"/>
+              <w:gridCol w:w="753"/>
             </w:tblGrid>
             <w:tr>
               <w:trPr>
@@ -289,8 +254,8 @@
                 <w:rFonts w:ascii="Arial" w:hAnsi="Arial" w:cs="Arial"/>
                 <w:b/>
                 <w:bCs/>
-                <w:sz w:val="8"/>
-                <w:szCs w:val="8"/>
+                <w:sz w:val="11"/>
+                <w:szCs w:val="11"/>
               </w:rPr>
             </w:pPr>
             <w:r>
@@ -298,10 +263,20 @@
                 <w:rFonts w:ascii="Arial" w:hAnsi="Arial" w:cs="Arial"/>
                 <w:b/>
                 <w:bCs/>
-                <w:sz w:val="8"/>
-                <w:szCs w:val="8"/>
+                <w:sz w:val="11"/>
+                <w:szCs w:val="11"/>
               </w:rPr>
-              <w:br/>
+              <w:t>{{Label1.Lineage}}</w:t>
+            </w:r>
+            <w:r>
+              <w:rPr>
+                <w:rFonts w:ascii="Arial" w:hAnsi="Arial" w:cs="Arial"/>
+                <w:b/>
+                <w:bCs/>
+                <w:sz w:val="11"/>
+                <w:szCs w:val="11"/>
+              </w:rPr>
+              <w:t xml:space="preserve"> </w:t>
             </w:r>
             <w:r>
               <w:rPr>
@@ -310,37 +285,6 @@
                 <w:bCs/>
                 <w:sz w:val="8"/>
                 <w:szCs w:val="8"/>
-              </w:rPr>
-              <w:t>{{Label1.Lineage}}</w:t>
-            </w:r>
-          </w:p>
-          <w:p>
-            <w:pPr>
-              <w:rPr>
-                <w:rFonts w:ascii="Arial" w:hAnsi="Arial" w:cs="Arial"/>
-                <w:b/>
-                <w:bCs/>
-                <w:sz w:val="8"/>
-                <w:szCs w:val="8"/>
-              </w:rPr>
-            </w:pPr>
-            <w:r>
-              <w:rPr>
-                <w:rFonts w:ascii="Arial" w:hAnsi="Arial" w:cs="Arial"/>
-                <w:b/>
-                <w:bCs/>
-                <w:sz w:val="8"/>
-                <w:szCs w:val="8"/>
-              </w:rPr>
-              <w:t xml:space="preserve"> </w:t>
-            </w:r>
-            <w:r>
-              <w:rPr>
-                <w:rFonts w:ascii="Arial" w:hAnsi="Arial" w:cs="Arial"/>
-                <w:b/>
-                <w:bCs/>
-                <w:sz w:val="4"/>
-                <w:szCs w:val="4"/>
               </w:rPr>
               <w:t>{{Label1.ProductStrain}}</w:t>
             </w:r>

</xml_diff>

<commit_message>
Update docx formatting, template processor, and font sizing
Co-authored-by: Cursor <cursoragent@cursor.com>
</commit_message>
<xml_diff>
--- a/src/core/generation/templates/Double.docx
+++ b/src/core/generation/templates/Double.docx
@@ -6,7 +6,6 @@
       <w:tblPr>
         <w:tblW w:w="0" w:type="auto"/>
         <w:jc w:val="center"/>
-        <w:tblLayout w:type="fixed"/>
         <w:tblCellMar>
           <w:left w:w="15" w:type="dxa"/>
           <w:right w:w="15" w:type="dxa"/>
@@ -14,7 +13,7 @@
         <w:tblLook w:val="0000" w:firstRow="0" w:lastRow="0" w:firstColumn="0" w:lastColumn="0" w:noHBand="0" w:noVBand="0"/>
       </w:tblPr>
       <w:tblGrid>
-        <w:gridCol w:w="2520"/>
+        <w:gridCol w:w="2564"/>
       </w:tblGrid>
       <w:tr>
         <w:trPr>
@@ -24,7 +23,7 @@
         </w:trPr>
         <w:tc>
           <w:tcPr>
-            <w:tcW w:w="2520" w:type="dxa"/>
+            <w:tcW w:w="0" w:type="auto"/>
             <w:noWrap/>
             <w:tcMar>
               <w:left w:w="58" w:type="dxa"/>
@@ -58,7 +57,7 @@
             <w:tr>
               <w:trPr>
                 <w:cantSplit/>
-                <w:trHeight w:hRule="exact" w:val="2312"/>
+                <w:trHeight w:hRule="exact" w:val="1944"/>
                 <w:jc w:val="center"/>
               </w:trPr>
               <w:tc>
@@ -100,17 +99,53 @@
                     <w:t>{{Label1.DescAndWeight}}</w:t>
                   </w:r>
                 </w:p>
+              </w:tc>
+            </w:tr>
+            <w:tr>
+              <w:trPr>
+                <w:cantSplit/>
+                <w:trHeight w:hRule="exact" w:val="216"/>
+                <w:jc w:val="center"/>
+              </w:trPr>
+              <w:tc>
+                <w:tcPr>
+                  <w:tcW w:w="2448" w:type="dxa"/>
+                  <w:tcBorders>
+                    <w:top w:val="nil"/>
+                    <w:left w:val="nil"/>
+                    <w:bottom w:val="nil"/>
+                    <w:right w:val="nil"/>
+                  </w:tcBorders>
+                  <w:shd w:val="clear" w:color="auto" w:fill="FFFFFF" w:themeFill="background1"/>
+                  <w:tcMar>
+                    <w:top w:w="58" w:type="dxa"/>
+                    <w:left w:w="58" w:type="dxa"/>
+                    <w:bottom w:w="58" w:type="dxa"/>
+                    <w:right w:w="58" w:type="dxa"/>
+                  </w:tcMar>
+                </w:tcPr>
                 <w:p>
                   <w:pPr>
                     <w:spacing w:line="216" w:lineRule="auto"/>
+                    <w:jc w:val="right"/>
                     <w:rPr>
                       <w:rFonts w:ascii="Arial" w:hAnsi="Arial" w:cs="Arial"/>
                       <w:b/>
                       <w:bCs/>
-                      <w:sz w:val="11"/>
-                      <w:szCs w:val="11"/>
+                      <w:sz w:val="10"/>
+                      <w:szCs w:val="10"/>
                     </w:rPr>
                   </w:pPr>
+                  <w:r>
+                    <w:rPr>
+                      <w:rFonts w:ascii="Arial" w:hAnsi="Arial" w:cs="Arial"/>
+                      <w:b/>
+                      <w:bCs/>
+                      <w:sz w:val="10"/>
+                      <w:szCs w:val="10"/>
+                    </w:rPr>
+                    <w:t>{{Label1.ProductVendor}}</w:t>
+                  </w:r>
                 </w:p>
               </w:tc>
             </w:tr>
@@ -138,13 +173,13 @@
             </w:tblPr>
             <w:tblGrid>
               <w:gridCol w:w="1074"/>
-              <w:gridCol w:w="621"/>
-              <w:gridCol w:w="753"/>
+              <w:gridCol w:w="613"/>
+              <w:gridCol w:w="761"/>
             </w:tblGrid>
             <w:tr>
               <w:trPr>
                 <w:cantSplit/>
-                <w:trHeight w:val="749"/>
+                <w:trHeight w:val="792"/>
               </w:trPr>
               <w:tc>
                 <w:tcPr>
@@ -254,8 +289,8 @@
                 <w:rFonts w:ascii="Arial" w:hAnsi="Arial" w:cs="Arial"/>
                 <w:b/>
                 <w:bCs/>
-                <w:sz w:val="11"/>
-                <w:szCs w:val="11"/>
+                <w:sz w:val="8"/>
+                <w:szCs w:val="8"/>
               </w:rPr>
             </w:pPr>
             <w:r>
@@ -263,18 +298,39 @@
                 <w:rFonts w:ascii="Arial" w:hAnsi="Arial" w:cs="Arial"/>
                 <w:b/>
                 <w:bCs/>
-                <w:sz w:val="11"/>
-                <w:szCs w:val="11"/>
+                <w:sz w:val="8"/>
+                <w:szCs w:val="8"/>
               </w:rPr>
-              <w:t>{{Label1.Lineage}}</w:t>
+              <w:br/>
             </w:r>
             <w:r>
               <w:rPr>
                 <w:rFonts w:ascii="Arial" w:hAnsi="Arial" w:cs="Arial"/>
                 <w:b/>
                 <w:bCs/>
-                <w:sz w:val="11"/>
-                <w:szCs w:val="11"/>
+                <w:sz w:val="8"/>
+                <w:szCs w:val="8"/>
+              </w:rPr>
+              <w:t>{{Label1.Lineage}}</w:t>
+            </w:r>
+          </w:p>
+          <w:p>
+            <w:pPr>
+              <w:rPr>
+                <w:rFonts w:ascii="Arial" w:hAnsi="Arial" w:cs="Arial"/>
+                <w:b/>
+                <w:bCs/>
+                <w:sz w:val="8"/>
+                <w:szCs w:val="8"/>
+              </w:rPr>
+            </w:pPr>
+            <w:r>
+              <w:rPr>
+                <w:rFonts w:ascii="Arial" w:hAnsi="Arial" w:cs="Arial"/>
+                <w:b/>
+                <w:bCs/>
+                <w:sz w:val="8"/>
+                <w:szCs w:val="8"/>
               </w:rPr>
               <w:t xml:space="preserve"> </w:t>
             </w:r>
@@ -283,8 +339,8 @@
                 <w:rFonts w:ascii="Arial" w:hAnsi="Arial" w:cs="Arial"/>
                 <w:b/>
                 <w:bCs/>
-                <w:sz w:val="8"/>
-                <w:szCs w:val="8"/>
+                <w:sz w:val="4"/>
+                <w:szCs w:val="4"/>
               </w:rPr>
               <w:t>{{Label1.ProductStrain}}</w:t>
             </w:r>

</xml_diff>

<commit_message>
Fix nonclassic weight (g->oz), align vertical font styling with horizontal
Co-authored-by: Cursor <cursoragent@cursor.com>
</commit_message>
<xml_diff>
--- a/src/core/generation/templates/Double.docx
+++ b/src/core/generation/templates/Double.docx
@@ -57,12 +57,12 @@
             <w:tr>
               <w:trPr>
                 <w:cantSplit/>
-                <w:trHeight w:hRule="exact" w:val="1973"/>
+                <w:trHeight w:val="1944"/>
                 <w:jc w:val="center"/>
               </w:trPr>
               <w:tc>
                 <w:tcPr>
-                  <w:tcW w:w="2376" w:type="dxa"/>
+                  <w:tcW w:w="2448" w:type="dxa"/>
                   <w:tcBorders>
                     <w:top w:val="nil"/>
                     <w:left w:val="nil"/>
@@ -179,7 +179,7 @@
             <w:tr>
               <w:trPr>
                 <w:cantSplit/>
-                <w:trHeight w:val="792"/>
+                <w:trHeight w:val="749"/>
               </w:trPr>
               <w:tc>
                 <w:tcPr>

</xml_diff>

<commit_message>
New User Template upload feature
</commit_message>
<xml_diff>
--- a/src/core/generation/templates/Double.docx
+++ b/src/core/generation/templates/Double.docx
@@ -13,7 +13,7 @@
         <w:tblLook w:val="0000" w:firstRow="0" w:lastRow="0" w:firstColumn="0" w:lastColumn="0" w:noHBand="0" w:noVBand="0"/>
       </w:tblPr>
       <w:tblGrid>
-        <w:gridCol w:w="2564"/>
+        <w:gridCol w:w="2593"/>
       </w:tblGrid>
       <w:tr>
         <w:trPr>
@@ -35,7 +35,7 @@
             <w:tblPr>
               <w:tblpPr w:leftFromText="187" w:rightFromText="187" w:vertAnchor="page" w:horzAnchor="margin" w:tblpXSpec="center" w:tblpY="29"/>
               <w:tblOverlap w:val="never"/>
-              <w:tblW w:w="2448" w:type="dxa"/>
+              <w:tblW w:w="2477" w:type="dxa"/>
               <w:jc w:val="center"/>
               <w:tblBorders>
                 <w:top w:val="single" w:sz="4" w:space="0" w:color="FFFFFF" w:themeColor="background1"/>
@@ -52,12 +52,12 @@
               <w:tblLook w:val="0000" w:firstRow="0" w:lastRow="0" w:firstColumn="0" w:lastColumn="0" w:noHBand="0" w:noVBand="0"/>
             </w:tblPr>
             <w:tblGrid>
-              <w:gridCol w:w="2448"/>
+              <w:gridCol w:w="2477"/>
             </w:tblGrid>
             <w:tr>
               <w:trPr>
                 <w:cantSplit/>
-                <w:trHeight w:val="1944"/>
+                <w:trHeight w:val="2189"/>
                 <w:jc w:val="center"/>
               </w:trPr>
               <w:tc>
@@ -71,9 +71,9 @@
                   </w:tcBorders>
                   <w:shd w:val="clear" w:color="auto" w:fill="FFFFFF" w:themeFill="background1"/>
                   <w:tcMar>
-                    <w:top w:w="58" w:type="dxa"/>
+                    <w:top w:w="14" w:type="dxa"/>
                     <w:left w:w="58" w:type="dxa"/>
-                    <w:bottom w:w="58" w:type="dxa"/>
+                    <w:bottom w:w="14" w:type="dxa"/>
                     <w:right w:w="58" w:type="dxa"/>
                   </w:tcMar>
                 </w:tcPr>
@@ -104,7 +104,7 @@
             <w:tr>
               <w:trPr>
                 <w:cantSplit/>
-                <w:trHeight w:hRule="exact" w:val="216"/>
+                <w:trHeight w:hRule="exact" w:val="158"/>
                 <w:jc w:val="center"/>
               </w:trPr>
               <w:tc>
@@ -118,9 +118,9 @@
                   </w:tcBorders>
                   <w:shd w:val="clear" w:color="auto" w:fill="FFFFFF" w:themeFill="background1"/>
                   <w:tcMar>
-                    <w:top w:w="58" w:type="dxa"/>
+                    <w:top w:w="0" w:type="dxa"/>
                     <w:left w:w="58" w:type="dxa"/>
-                    <w:bottom w:w="58" w:type="dxa"/>
+                    <w:bottom w:w="0" w:type="dxa"/>
                     <w:right w:w="58" w:type="dxa"/>
                   </w:tcMar>
                 </w:tcPr>
@@ -132,8 +132,8 @@
                       <w:rFonts w:ascii="Arial" w:hAnsi="Arial" w:cs="Arial"/>
                       <w:b/>
                       <w:bCs/>
-                      <w:sz w:val="10"/>
-                      <w:szCs w:val="10"/>
+                      <w:sz w:val="6"/>
+                      <w:szCs w:val="6"/>
                     </w:rPr>
                   </w:pPr>
                   <w:r>
@@ -141,8 +141,8 @@
                       <w:rFonts w:ascii="Arial" w:hAnsi="Arial" w:cs="Arial"/>
                       <w:b/>
                       <w:bCs/>
-                      <w:sz w:val="10"/>
-                      <w:szCs w:val="10"/>
+                      <w:sz w:val="6"/>
+                      <w:szCs w:val="6"/>
                     </w:rPr>
                     <w:t>{{Label1.ProductVendor}}</w:t>
                   </w:r>
@@ -153,9 +153,9 @@
           <w:tbl>
             <w:tblPr>
               <w:tblStyle w:val="TableGrid"/>
-              <w:tblpPr w:vertAnchor="page" w:horzAnchor="margin" w:tblpXSpec="center" w:tblpY="2750"/>
+              <w:tblpPr w:vertAnchor="page" w:horzAnchor="margin" w:tblpXSpec="center" w:tblpY="2809"/>
               <w:tblOverlap w:val="never"/>
-              <w:tblW w:w="2448" w:type="dxa"/>
+              <w:tblW w:w="2477" w:type="dxa"/>
               <w:tblBorders>
                 <w:top w:val="none" w:sz="0" w:space="0" w:color="auto"/>
                 <w:left w:val="none" w:sz="0" w:space="0" w:color="auto"/>
@@ -172,9 +172,9 @@
               <w:tblLook w:val="04A0" w:firstRow="1" w:lastRow="0" w:firstColumn="1" w:lastColumn="0" w:noHBand="0" w:noVBand="1"/>
             </w:tblPr>
             <w:tblGrid>
-              <w:gridCol w:w="1074"/>
-              <w:gridCol w:w="613"/>
-              <w:gridCol w:w="761"/>
+              <w:gridCol w:w="1083"/>
+              <w:gridCol w:w="626"/>
+              <w:gridCol w:w="768"/>
             </w:tblGrid>
             <w:tr>
               <w:trPr>
@@ -301,61 +301,8 @@
                 <w:sz w:val="8"/>
                 <w:szCs w:val="8"/>
               </w:rPr>
-              <w:br/>
-            </w:r>
-            <w:r>
-              <w:rPr>
-                <w:rFonts w:ascii="Arial" w:hAnsi="Arial" w:cs="Arial"/>
-                <w:b/>
-                <w:bCs/>
-                <w:sz w:val="8"/>
-                <w:szCs w:val="8"/>
-              </w:rPr>
               <w:t>{{Label1.Lineage}}</w:t>
             </w:r>
-          </w:p>
-          <w:p>
-            <w:pPr>
-              <w:rPr>
-                <w:rFonts w:ascii="Arial" w:hAnsi="Arial" w:cs="Arial"/>
-                <w:b/>
-                <w:bCs/>
-                <w:sz w:val="8"/>
-                <w:szCs w:val="8"/>
-              </w:rPr>
-            </w:pPr>
-            <w:r>
-              <w:rPr>
-                <w:rFonts w:ascii="Arial" w:hAnsi="Arial" w:cs="Arial"/>
-                <w:b/>
-                <w:bCs/>
-                <w:sz w:val="8"/>
-                <w:szCs w:val="8"/>
-              </w:rPr>
-              <w:t xml:space="preserve"> </w:t>
-            </w:r>
-            <w:r>
-              <w:rPr>
-                <w:rFonts w:ascii="Arial" w:hAnsi="Arial" w:cs="Arial"/>
-                <w:b/>
-                <w:bCs/>
-                <w:sz w:val="4"/>
-                <w:szCs w:val="4"/>
-              </w:rPr>
-              <w:t>{{Label1.ProductStrain}}</w:t>
-            </w:r>
-          </w:p>
-          <w:p>
-            <w:pPr>
-              <w:jc w:val="center"/>
-              <w:rPr>
-                <w:rFonts w:ascii="Arial" w:hAnsi="Arial" w:cs="Arial"/>
-                <w:b/>
-                <w:bCs/>
-                <w:sz w:val="11"/>
-                <w:szCs w:val="11"/>
-              </w:rPr>
-            </w:pPr>
           </w:p>
         </w:tc>
       </w:tr>

</xml_diff>